<commit_message>
Align CV with portfolio, add BE coursework, fix dead Air University link
- CV: "per cent" corrected to "percent" (5 places)
- CV: address now "Dublin, Ireland", matching the site
- CV: job titles drop the ", Solar PV" suffix, matching the site
- CV: SketchUp added to design software
- CV: certifications rewritten to the seven verified entries with issuers
  and dates; ASME moved to Activities as "Student member of ASME"
- CV and site: BE Mechatronics coursework added, taken from the HEC
  national Mechatronics Engineering BS/BE curriculum
- Site: Air University department URL 404s since their site was rebuilt,
  so the link now points at the university home page
- PDF regenerated and both CV files refreshed in public/

Co-Authored-By: Claude Opus 5 <noreply@anthropic.com>
</commit_message>
<xml_diff>
--- a/public/Usama-Javed-CV.docx
+++ b/public/Usama-Javed-CV.docx
@@ -34,7 +34,7 @@
           <w:sz w:val="22"/>
           <w:szCs w:val="22"/>
         </w:rPr>
-        <w:t xml:space="preserve">Solar PV Project Delivery, Site Supervision &amp; Project Planning</w:t>
+        <w:t xml:space="preserve">Solar PV Delivery, Site Supervision &amp; Planning</w:t>
       </w:r>
     </w:p>
     <w:p>
@@ -51,7 +51,7 @@
           <w:sz w:val="19"/>
           <w:szCs w:val="19"/>
         </w:rPr>
-        <w:t xml:space="preserve">Adamstown, Dublin, Ireland   •   +353 85 773 5337   •   usamajaved1305@gmail.com</w:t>
+        <w:t xml:space="preserve">Dublin, Ireland   •   +353 85 773 5337   •   usamajaved1305@gmail.com</w:t>
       </w:r>
     </w:p>
     <w:p>
@@ -87,7 +87,7 @@
           <w:sz w:val="19"/>
           <w:szCs w:val="19"/>
         </w:rPr>
-        <w:t xml:space="preserve">Mechatronics engineer with three and a half years delivering solar PV projects from site survey through installation, commissioning and client handover, across on-grid, hybrid and off-grid systems. Portfolio of roughly 70 per cent residential and 30 per cent commercial work, from small domestic systems to factory rooftops. Experienced leading installation crews on live sites and equally strong on the planning side: building project programmes, controlling bills of material and budgets, tracking milestones against baseline and reporting progress to stakeholders. Currently completing an MSc in Business Analytics at Dublin Business School, applying Power BI, SQL and Python to project reporting and forecasting. Dublin based.</w:t>
+        <w:t xml:space="preserve">Mechatronics engineer with three and a half years delivering solar PV projects from site survey through installation, commissioning and client handover, across on-grid, hybrid and off-grid systems. Portfolio of roughly 70 percent residential and 30 percent commercial work, from small domestic systems to factory rooftops. Experienced leading installation crews on live sites and equally strong on the planning side: building project programmes, controlling bills of material and budgets, tracking milestones against baseline and reporting progress to stakeholders. Currently completing an MSc in Business Analytics at Dublin Business School, applying Power BI, SQL and Python to project reporting and forecasting. Dublin based.</w:t>
       </w:r>
     </w:p>
     <w:p>
@@ -146,7 +146,7 @@
           <w:sz w:val="19"/>
           <w:szCs w:val="19"/>
         </w:rPr>
-        <w:t xml:space="preserve">Managed 36 projects totalling 790 kWp in a single year at 85 per cent on-time completion, against supplier stock shortages and labour constraints.</w:t>
+        <w:t xml:space="preserve">Managed 36 projects totalling 790 kWp in a single year at 85 percent on-time completion, against supplier stock shortages and labour constraints.</w:t>
       </w:r>
     </w:p>
     <w:p>
@@ -426,7 +426,7 @@
           <w:sz w:val="19"/>
           <w:szCs w:val="19"/>
         </w:rPr>
-        <w:t xml:space="preserve">Helioscope, OpenSolar, SolidWorks.</w:t>
+        <w:t xml:space="preserve">Helioscope, OpenSolar, SketchUp, SolidWorks.</w:t>
       </w:r>
     </w:p>
     <w:p>
@@ -463,7 +463,7 @@
           <w:sz w:val="20"/>
           <w:szCs w:val="20"/>
         </w:rPr>
-        <w:t xml:space="preserve">Project Manager, Solar PV</w:t>
+        <w:t xml:space="preserve">Project Manager</w:t>
       </w:r>
       <w:r>
         <w:rPr>
@@ -547,7 +547,7 @@
           <w:sz w:val="19"/>
           <w:szCs w:val="19"/>
         </w:rPr>
-        <w:t xml:space="preserve">Held 85 per cent on-time completion, tracing slippage to material availability and labour shortages and re-sequencing works to contain the impact on downstream activities.</w:t>
+        <w:t xml:space="preserve">Held 85 percent on-time completion, tracing slippage to material availability and labour shortages and re-sequencing works to contain the impact on downstream activities.</w:t>
       </w:r>
     </w:p>
     <w:p>
@@ -620,7 +620,7 @@
           <w:sz w:val="20"/>
           <w:szCs w:val="20"/>
         </w:rPr>
-        <w:t xml:space="preserve">Senior Project Engineer, Solar PV</w:t>
+        <w:t xml:space="preserve">Senior Project Engineer</w:t>
       </w:r>
       <w:r>
         <w:rPr>
@@ -685,7 +685,7 @@
           <w:sz w:val="19"/>
           <w:szCs w:val="19"/>
         </w:rPr>
-        <w:t xml:space="preserve">Delivered 85 to 95 per cent of projects within the agreed programme while running two concurrent projects at a time.</w:t>
+        <w:t xml:space="preserve">Delivered 85 to 95 percent of projects within the agreed programme while running two concurrent projects at a time.</w:t>
       </w:r>
     </w:p>
     <w:p>
@@ -777,7 +777,7 @@
           <w:sz w:val="20"/>
           <w:szCs w:val="20"/>
         </w:rPr>
-        <w:t xml:space="preserve">Project Engineer, Solar PV</w:t>
+        <w:t xml:space="preserve">Project Engineer</w:t>
       </w:r>
       <w:r>
         <w:rPr>
@@ -1180,6 +1180,21 @@
     </w:p>
     <w:p>
       <w:pPr>
+        <w:spacing w:after="90" w:line="264"/>
+        <w:jc w:val="both"/>
+      </w:pPr>
+      <w:r>
+        <w:rPr>
+          <w:rFonts w:ascii="Calibri" w:cs="Calibri" w:eastAsia="Calibri" w:hAnsi="Calibri"/>
+          <w:color w:val="1A1A1A"/>
+          <w:sz w:val="19"/>
+          <w:szCs w:val="19"/>
+        </w:rPr>
+        <w:t xml:space="preserve">Coursework: electric circuits analysis, electronic devices and circuits, control systems, instrumentation and measurement, manufacturing automation, engineering statics, mechanics of materials, fundamentals of thermal sciences, engineering drawing and solid modelling, modelling and simulation, engineering economics.</w:t>
+      </w:r>
+    </w:p>
+    <w:p>
+      <w:pPr>
         <w:pBdr>
           <w:bottom w:val="single" w:color="C8D3D8" w:sz="4" w:space="4"/>
         </w:pBdr>
@@ -1217,46 +1232,16 @@
           <w:sz w:val="19"/>
           <w:szCs w:val="19"/>
         </w:rPr>
-        <w:t xml:space="preserve">Google Project Management:  </w:t>
-      </w:r>
-      <w:r>
-        <w:rPr>
-          <w:rFonts w:ascii="Calibri" w:cs="Calibri" w:eastAsia="Calibri" w:hAnsi="Calibri"/>
-          <w:color w:val="1A1A1A"/>
-          <w:sz w:val="19"/>
-          <w:szCs w:val="19"/>
-        </w:rPr>
-        <w:t xml:space="preserve">Google Career Certificate covering scheduling, budgeting, risk and stakeholder management.</w:t>
-      </w:r>
-    </w:p>
-    <w:p>
-      <w:pPr>
-        <w:pStyle w:val="ListParagraph"/>
-        <w:numPr>
-          <w:ilvl w:val="0"/>
-          <w:numId w:val="2"/>
-        </w:numPr>
-        <w:spacing w:after="56" w:line="252"/>
-      </w:pPr>
-      <w:r>
-        <w:rPr>
-          <w:rFonts w:ascii="Calibri" w:cs="Calibri" w:eastAsia="Calibri" w:hAnsi="Calibri"/>
-          <w:b/>
-          <w:bCs/>
-          <w:color w:val="1A1A1A"/>
-          <w:sz w:val="19"/>
-          <w:szCs w:val="19"/>
-        </w:rPr>
-        <w:t xml:space="preserve">Solar PV Design and Installation:  </w:t>
-      </w:r>
-      <w:r>
-        <w:rPr>
-          <w:rFonts w:ascii="Calibri" w:cs="Calibri" w:eastAsia="Calibri" w:hAnsi="Calibri"/>
-          <w:color w:val="1A1A1A"/>
-          <w:sz w:val="19"/>
-          <w:szCs w:val="19"/>
-        </w:rPr>
-        <w:t xml:space="preserve">Sean White, NABCEP aligned curriculum.</w:t>
+        <w:t xml:space="preserve">Foundations of Project Management:  </w:t>
+      </w:r>
+      <w:r>
+        <w:rPr>
+          <w:rFonts w:ascii="Calibri" w:cs="Calibri" w:eastAsia="Calibri" w:hAnsi="Calibri"/>
+          <w:color w:val="1A1A1A"/>
+          <w:sz w:val="19"/>
+          <w:szCs w:val="19"/>
+        </w:rPr>
+        <w:t xml:space="preserve">Google Career Certificate on Coursera, Sep 2026. Scheduling, budgeting, risk and stakeholder management.</w:t>
       </w:r>
     </w:p>
     <w:p>
@@ -1286,7 +1271,37 @@
           <w:sz w:val="19"/>
           <w:szCs w:val="19"/>
         </w:rPr>
-        <w:t xml:space="preserve">Technical University of Denmark (DTU).</w:t>
+        <w:t xml:space="preserve">Technical University of Denmark (DTU) on Coursera, Sep 2024.</w:t>
+      </w:r>
+    </w:p>
+    <w:p>
+      <w:pPr>
+        <w:pStyle w:val="ListParagraph"/>
+        <w:numPr>
+          <w:ilvl w:val="0"/>
+          <w:numId w:val="2"/>
+        </w:numPr>
+        <w:spacing w:after="56" w:line="252"/>
+      </w:pPr>
+      <w:r>
+        <w:rPr>
+          <w:rFonts w:ascii="Calibri" w:cs="Calibri" w:eastAsia="Calibri" w:hAnsi="Calibri"/>
+          <w:b/>
+          <w:bCs/>
+          <w:color w:val="1A1A1A"/>
+          <w:sz w:val="19"/>
+          <w:szCs w:val="19"/>
+        </w:rPr>
+        <w:t xml:space="preserve">Solar Energy and Electrical System Design:  </w:t>
+      </w:r>
+      <w:r>
+        <w:rPr>
+          <w:rFonts w:ascii="Calibri" w:cs="Calibri" w:eastAsia="Calibri" w:hAnsi="Calibri"/>
+          <w:color w:val="1A1A1A"/>
+          <w:sz w:val="19"/>
+          <w:szCs w:val="19"/>
+        </w:rPr>
+        <w:t xml:space="preserve">University at Buffalo on Coursera, Sep 2024.</w:t>
       </w:r>
     </w:p>
     <w:p>
@@ -1316,37 +1331,97 @@
           <w:sz w:val="19"/>
           <w:szCs w:val="19"/>
         </w:rPr>
-        <w:t xml:space="preserve">State University of New York (SUNY).</w:t>
-      </w:r>
-    </w:p>
-    <w:p>
-      <w:pPr>
-        <w:pStyle w:val="ListParagraph"/>
-        <w:numPr>
-          <w:ilvl w:val="0"/>
-          <w:numId w:val="2"/>
-        </w:numPr>
-        <w:spacing w:after="56" w:line="252"/>
-      </w:pPr>
-      <w:r>
-        <w:rPr>
-          <w:rFonts w:ascii="Calibri" w:cs="Calibri" w:eastAsia="Calibri" w:hAnsi="Calibri"/>
-          <w:b/>
-          <w:bCs/>
-          <w:color w:val="1A1A1A"/>
-          <w:sz w:val="19"/>
-          <w:szCs w:val="19"/>
-        </w:rPr>
-        <w:t xml:space="preserve">Solar Residential Sales:  </w:t>
-      </w:r>
-      <w:r>
-        <w:rPr>
-          <w:rFonts w:ascii="Calibri" w:cs="Calibri" w:eastAsia="Calibri" w:hAnsi="Calibri"/>
-          <w:color w:val="1A1A1A"/>
-          <w:sz w:val="19"/>
-          <w:szCs w:val="19"/>
-        </w:rPr>
-        <w:t xml:space="preserve">SolarEdge Technologies.</w:t>
+        <w:t xml:space="preserve">State University of New York (SUNY) on Coursera, Sep 2024.</w:t>
+      </w:r>
+    </w:p>
+    <w:p>
+      <w:pPr>
+        <w:pStyle w:val="ListParagraph"/>
+        <w:numPr>
+          <w:ilvl w:val="0"/>
+          <w:numId w:val="2"/>
+        </w:numPr>
+        <w:spacing w:after="56" w:line="252"/>
+      </w:pPr>
+      <w:r>
+        <w:rPr>
+          <w:rFonts w:ascii="Calibri" w:cs="Calibri" w:eastAsia="Calibri" w:hAnsi="Calibri"/>
+          <w:b/>
+          <w:bCs/>
+          <w:color w:val="1A1A1A"/>
+          <w:sz w:val="19"/>
+          <w:szCs w:val="19"/>
+        </w:rPr>
+        <w:t xml:space="preserve">Introduction to Solar PV Design, Installation and Code:  </w:t>
+      </w:r>
+      <w:r>
+        <w:rPr>
+          <w:rFonts w:ascii="Calibri" w:cs="Calibri" w:eastAsia="Calibri" w:hAnsi="Calibri"/>
+          <w:color w:val="1A1A1A"/>
+          <w:sz w:val="19"/>
+          <w:szCs w:val="19"/>
+        </w:rPr>
+        <w:t xml:space="preserve">HeatSpring, taught by Sean White, approved for NABCEP hours, Jul 2024.</w:t>
+      </w:r>
+    </w:p>
+    <w:p>
+      <w:pPr>
+        <w:pStyle w:val="ListParagraph"/>
+        <w:numPr>
+          <w:ilvl w:val="0"/>
+          <w:numId w:val="2"/>
+        </w:numPr>
+        <w:spacing w:after="56" w:line="252"/>
+      </w:pPr>
+      <w:r>
+        <w:rPr>
+          <w:rFonts w:ascii="Calibri" w:cs="Calibri" w:eastAsia="Calibri" w:hAnsi="Calibri"/>
+          <w:b/>
+          <w:bCs/>
+          <w:color w:val="1A1A1A"/>
+          <w:sz w:val="19"/>
+          <w:szCs w:val="19"/>
+        </w:rPr>
+        <w:t xml:space="preserve">Know Your Code, Solar Roof Mounting:  </w:t>
+      </w:r>
+      <w:r>
+        <w:rPr>
+          <w:rFonts w:ascii="Calibri" w:cs="Calibri" w:eastAsia="Calibri" w:hAnsi="Calibri"/>
+          <w:color w:val="1A1A1A"/>
+          <w:sz w:val="19"/>
+          <w:szCs w:val="19"/>
+        </w:rPr>
+        <w:t xml:space="preserve">IronRidge, Mar 2024.</w:t>
+      </w:r>
+    </w:p>
+    <w:p>
+      <w:pPr>
+        <w:pStyle w:val="ListParagraph"/>
+        <w:numPr>
+          <w:ilvl w:val="0"/>
+          <w:numId w:val="2"/>
+        </w:numPr>
+        <w:spacing w:after="56" w:line="252"/>
+      </w:pPr>
+      <w:r>
+        <w:rPr>
+          <w:rFonts w:ascii="Calibri" w:cs="Calibri" w:eastAsia="Calibri" w:hAnsi="Calibri"/>
+          <w:b/>
+          <w:bCs/>
+          <w:color w:val="1A1A1A"/>
+          <w:sz w:val="19"/>
+          <w:szCs w:val="19"/>
+        </w:rPr>
+        <w:t xml:space="preserve">Solar 101, Residential Sales:  </w:t>
+      </w:r>
+      <w:r>
+        <w:rPr>
+          <w:rFonts w:ascii="Calibri" w:cs="Calibri" w:eastAsia="Calibri" w:hAnsi="Calibri"/>
+          <w:color w:val="1A1A1A"/>
+          <w:sz w:val="19"/>
+          <w:szCs w:val="19"/>
+        </w:rPr>
+        <w:t xml:space="preserve">SolarEdge Technologies, Sep 2024.</w:t>
       </w:r>
     </w:p>
     <w:p>
@@ -1427,7 +1502,7 @@
           <w:sz w:val="19"/>
           <w:szCs w:val="19"/>
         </w:rPr>
-        <w:t xml:space="preserve">Member of ASME; competitor in inter university robotics competitions; member of the Air University Cultural Society.</w:t>
+        <w:t xml:space="preserve">Student member of ASME, 2018 to 2019; competitor in inter university robotics competitions; member of the Air University Cultural Society.</w:t>
       </w:r>
     </w:p>
     <w:sectPr>

</xml_diff>

<commit_message>
CV: portfolio and LinkedIn links, Google course labelled correctly, canopy project, university builds labelled, real tab stops, PDF title; vercel.json: root-safe www and vercel.app redirects, noindex on RSC payloads
Co-Authored-By: Claude Opus 5.5 <noreply@anthropic.com>
</commit_message>
<xml_diff>
--- a/public/Usama-Javed-CV.docx
+++ b/public/Usama-Javed-CV.docx
@@ -46,8 +46,50 @@
         <w:rPr>
           <w:color w:val="555555"/>
         </w:rPr>
-        <w:t>Dublin, Ireland   •   +353 85 773 5337   •   usamajaved1305@gmail.com</w:t>
-      </w:r>
+        <w:t xml:space="preserve">Dublin, Ireland   •   +353 85 773 5337   •   </w:t>
+      </w:r>
+      <w:hyperlink r:id="rId5" w:history="1">
+        <w:r>
+          <w:rPr>
+            <w:rStyle w:val="Hyperlink"/>
+            <w:color w:val="555555"/>
+            <w:u w:val="none"/>
+          </w:rPr>
+          <w:t>usamajaved1305@gmail.com</w:t>
+        </w:r>
+      </w:hyperlink>
+      <w:r>
+        <w:rPr>
+          <w:color w:val="555555"/>
+        </w:rPr>
+        <w:br/>
+      </w:r>
+      <w:hyperlink r:id="rId6" w:history="1">
+        <w:r>
+          <w:rPr>
+            <w:rStyle w:val="Hyperlink"/>
+            <w:color w:val="555555"/>
+            <w:u w:val="none"/>
+          </w:rPr>
+          <w:t>usamajaved.ie</w:t>
+        </w:r>
+      </w:hyperlink>
+      <w:r>
+        <w:rPr>
+          <w:color w:val="555555"/>
+        </w:rPr>
+        <w:t xml:space="preserve">   •   </w:t>
+      </w:r>
+      <w:hyperlink r:id="rId7" w:history="1">
+        <w:r>
+          <w:rPr>
+            <w:rStyle w:val="Hyperlink"/>
+            <w:color w:val="555555"/>
+            <w:u w:val="none"/>
+          </w:rPr>
+          <w:t>linkedin.com/in/usama-javed-553b8624b</w:t>
+        </w:r>
+      </w:hyperlink>
     </w:p>
     <w:p>
       <w:pPr>
@@ -72,13 +114,36 @@
     <w:p>
       <w:pPr>
         <w:spacing w:after="40" w:line="264" w:lineRule="auto"/>
-        <w:jc w:val="both"/>
-      </w:pPr>
-      <w:r>
-        <w:rPr>
-          <w:color w:val="1A1A1A"/>
-        </w:rPr>
-        <w:t xml:space="preserve">Mechatronics engineer with three and a half years delivering solar PV projects from site survey through installation, commissioning and client handover, across on-grid, hybrid and off-grid systems. Portfolio of roughly 70 percent residential and 30 percent commercial work, </w:t>
+      </w:pPr>
+      <w:r>
+        <w:rPr>
+          <w:color w:val="1A1A1A"/>
+        </w:rPr>
+        <w:t>Mechatronics engineer with three and a half years delivering solar PV projects from site survey through installation, commissioning and client handover, across on-grid, hybrid and off-grid systems. Portfolio of roughly 70</w:t>
+      </w:r>
+      <w:r>
+        <w:rPr>
+          <w:color w:val="1A1A1A"/>
+        </w:rPr>
+        <w:t>%</w:t>
+      </w:r>
+      <w:r>
+        <w:rPr>
+          <w:color w:val="1A1A1A"/>
+        </w:rPr>
+        <w:t xml:space="preserve"> residential and 30</w:t>
+      </w:r>
+      <w:r>
+        <w:rPr>
+          <w:color w:val="1A1A1A"/>
+        </w:rPr>
+        <w:t>%</w:t>
+      </w:r>
+      <w:r>
+        <w:rPr>
+          <w:color w:val="1A1A1A"/>
+        </w:rPr>
+        <w:t xml:space="preserve"> commercial work, </w:t>
       </w:r>
       <w:r>
         <w:rPr>
@@ -90,7 +155,25 @@
         <w:rPr>
           <w:color w:val="1A1A1A"/>
         </w:rPr>
-        <w:t xml:space="preserve"> Experienced leading installation crews on live sites and equally strong on the planning side: building project programmes, controlling bills of material and budgets, tracking milestones against baseline and reporting progress to stakeholders. Currently completing an MSc in Business Analytics at Dublin Business School, applying Power BI, SQL and Python to project reporting and forecasting. Dublin based.</w:t>
+        <w:t xml:space="preserve"> Experienced leading installation crews on live sites and equally strong on the planning side: building project programmes, controlling bills of material and budgets, tracking milestones against baseline and reporting progress to stakeholders. </w:t>
+      </w:r>
+      <w:r>
+        <w:rPr>
+          <w:color w:val="1A1A1A"/>
+        </w:rPr>
+        <w:t>Currently studying for an MSc</w:t>
+      </w:r>
+      <w:r>
+        <w:rPr>
+          <w:color w:val="1A1A1A"/>
+        </w:rPr>
+        <w:t xml:space="preserve"> in Business Analytics at Dublin Business School, applying Power BI, SQL and Python to project reporting and </w:t>
+      </w:r>
+      <w:r>
+        <w:rPr>
+          <w:color w:val="1A1A1A"/>
+        </w:rPr>
+        <w:t>forecasting.</w:t>
       </w:r>
     </w:p>
     <w:p>
@@ -154,7 +237,19 @@
         <w:rPr>
           <w:color w:val="1A1A1A"/>
         </w:rPr>
-        <w:t>in a single year at 85 to 90 percent on-time completion</w:t>
+        <w:t>in a single year at 85 to 90</w:t>
+      </w:r>
+      <w:r>
+        <w:rPr>
+          <w:color w:val="1A1A1A"/>
+        </w:rPr>
+        <w:t>%</w:t>
+      </w:r>
+      <w:r>
+        <w:rPr>
+          <w:color w:val="1A1A1A"/>
+        </w:rPr>
+        <w:t xml:space="preserve"> on-time completion</w:t>
       </w:r>
       <w:r>
         <w:rPr>
@@ -220,7 +315,19 @@
         <w:rPr>
           <w:color w:val="1A1A1A"/>
         </w:rPr>
-        <w:t>installation crew leadership, daily work allocation, activity sequencing, workmanship inspection, snag close out, client handover.</w:t>
+        <w:t xml:space="preserve">installation crew leadership, daily work allocation, activity sequencing, workmanship inspection, snag </w:t>
+      </w:r>
+      <w:r>
+        <w:rPr>
+          <w:color w:val="1A1A1A"/>
+        </w:rPr>
+        <w:t>close-out</w:t>
+      </w:r>
+      <w:r>
+        <w:rPr>
+          <w:color w:val="1A1A1A"/>
+        </w:rPr>
+        <w:t>, client handover.</w:t>
       </w:r>
     </w:p>
     <w:p>
@@ -268,7 +375,19 @@
         <w:rPr>
           <w:color w:val="1A1A1A"/>
         </w:rPr>
-        <w:t>work breakdown structure, baselines, milestone tracking, critical path awareness, look ahead programmes, variance reporting, recovery planning.</w:t>
+        <w:t xml:space="preserve">work breakdown structure, baselines, milestone tracking, critical path awareness, </w:t>
+      </w:r>
+      <w:r>
+        <w:rPr>
+          <w:color w:val="1A1A1A"/>
+        </w:rPr>
+        <w:t>look-ahead</w:t>
+      </w:r>
+      <w:r>
+        <w:rPr>
+          <w:color w:val="1A1A1A"/>
+        </w:rPr>
+        <w:t xml:space="preserve"> programmes, variance reporting, recovery planning.</w:t>
       </w:r>
     </w:p>
     <w:p>
@@ -292,7 +411,19 @@
         <w:rPr>
           <w:color w:val="1A1A1A"/>
         </w:rPr>
-        <w:t>budget control, bill of materials, material call off planning, long lead item tracking.</w:t>
+        <w:t xml:space="preserve">budget control, bill of materials, material </w:t>
+      </w:r>
+      <w:r>
+        <w:rPr>
+          <w:color w:val="1A1A1A"/>
+        </w:rPr>
+        <w:t>call-off</w:t>
+      </w:r>
+      <w:r>
+        <w:rPr>
+          <w:color w:val="1A1A1A"/>
+        </w:rPr>
+        <w:t xml:space="preserve"> planning, long lead item tracking.</w:t>
       </w:r>
     </w:p>
     <w:p>
@@ -316,7 +447,31 @@
         <w:rPr>
           <w:color w:val="1A1A1A"/>
         </w:rPr>
-        <w:t>testing, fault finding, as built documentation, post installation support.</w:t>
+        <w:t xml:space="preserve">testing, fault finding, </w:t>
+      </w:r>
+      <w:r>
+        <w:rPr>
+          <w:color w:val="1A1A1A"/>
+        </w:rPr>
+        <w:t>as-built</w:t>
+      </w:r>
+      <w:r>
+        <w:rPr>
+          <w:color w:val="1A1A1A"/>
+        </w:rPr>
+        <w:t xml:space="preserve"> documentation, </w:t>
+      </w:r>
+      <w:r>
+        <w:rPr>
+          <w:color w:val="1A1A1A"/>
+        </w:rPr>
+        <w:t>post-installation</w:t>
+      </w:r>
+      <w:r>
+        <w:rPr>
+          <w:color w:val="1A1A1A"/>
+        </w:rPr>
+        <w:t xml:space="preserve"> support.</w:t>
       </w:r>
     </w:p>
     <w:p>
@@ -388,7 +543,13 @@
         <w:rPr>
           <w:color w:val="1A1A1A"/>
         </w:rPr>
-        <w:t>Helioscope, OpenSolar, SketchUp, AutoCAD.</w:t>
+        <w:t>HelioScope</w:t>
+      </w:r>
+      <w:r>
+        <w:rPr>
+          <w:color w:val="1A1A1A"/>
+        </w:rPr>
+        <w:t>, OpenSolar, SketchUp, AutoCAD.</w:t>
       </w:r>
     </w:p>
     <w:p>
@@ -413,6 +574,9 @@
     </w:p>
     <w:p>
       <w:pPr>
+        <w:tabs>
+          <w:tab w:val="right" w:pos="10180"/>
+        </w:tabs>
         <w:spacing w:before="142"/>
       </w:pPr>
       <w:r>
@@ -438,7 +602,7 @@
           <w:sz w:val="20"/>
           <w:szCs w:val="20"/>
         </w:rPr>
-        <w:ptab w:relativeTo="margin" w:alignment="right" w:leader="none"/>
+        <w:tab/>
       </w:r>
       <w:r>
         <w:rPr>
@@ -496,7 +660,19 @@
         <w:rPr>
           <w:color w:val="1A1A1A"/>
         </w:rPr>
-        <w:t>Held 85 to 90 percent on-time completion, tracing slippage</w:t>
+        <w:t>Held 85 to 90</w:t>
+      </w:r>
+      <w:r>
+        <w:rPr>
+          <w:color w:val="1A1A1A"/>
+        </w:rPr>
+        <w:t>%</w:t>
+      </w:r>
+      <w:r>
+        <w:rPr>
+          <w:color w:val="1A1A1A"/>
+        </w:rPr>
+        <w:t xml:space="preserve"> on-time completion, tracing slippage</w:t>
       </w:r>
       <w:r>
         <w:rPr>
@@ -555,6 +731,9 @@
     </w:p>
     <w:p>
       <w:pPr>
+        <w:tabs>
+          <w:tab w:val="right" w:pos="10180"/>
+        </w:tabs>
         <w:spacing w:before="142"/>
       </w:pPr>
       <w:r>
@@ -580,7 +759,7 @@
           <w:sz w:val="20"/>
           <w:szCs w:val="20"/>
         </w:rPr>
-        <w:ptab w:relativeTo="margin" w:alignment="right" w:leader="none"/>
+        <w:tab/>
       </w:r>
       <w:r>
         <w:rPr>
@@ -634,23 +813,47 @@
         <w:rPr>
           <w:color w:val="1A1A1A"/>
         </w:rPr>
-        <w:t>Delivered 85 to 95 percent of projects within the agreed programme while running two concurrent projects at a time.</w:t>
-      </w:r>
-    </w:p>
-    <w:p>
-      <w:pPr>
-        <w:pStyle w:val="ListParagraph"/>
-        <w:numPr>
-          <w:ilvl w:val="0"/>
-          <w:numId w:val="2"/>
-        </w:numPr>
-        <w:spacing w:after="56" w:line="252" w:lineRule="auto"/>
-      </w:pPr>
-      <w:r>
-        <w:rPr>
-          <w:color w:val="1A1A1A"/>
-        </w:rPr>
-        <w:t>Managed a two month programme delay caused by an inverter supply shortage, re-planning installation dates and re-sequencing site works to limit knock-on effects for the client.</w:t>
+        <w:t>Delivered 85 to 95</w:t>
+      </w:r>
+      <w:r>
+        <w:rPr>
+          <w:color w:val="1A1A1A"/>
+        </w:rPr>
+        <w:t>%</w:t>
+      </w:r>
+      <w:r>
+        <w:rPr>
+          <w:color w:val="1A1A1A"/>
+        </w:rPr>
+        <w:t xml:space="preserve"> of projects within the agreed programme while running two concurrent projects at a time.</w:t>
+      </w:r>
+    </w:p>
+    <w:p>
+      <w:pPr>
+        <w:pStyle w:val="ListParagraph"/>
+        <w:numPr>
+          <w:ilvl w:val="0"/>
+          <w:numId w:val="2"/>
+        </w:numPr>
+        <w:spacing w:after="56" w:line="252" w:lineRule="auto"/>
+      </w:pPr>
+      <w:r>
+        <w:rPr>
+          <w:color w:val="1A1A1A"/>
+        </w:rPr>
+        <w:t xml:space="preserve">Managed a </w:t>
+      </w:r>
+      <w:r>
+        <w:rPr>
+          <w:color w:val="1A1A1A"/>
+        </w:rPr>
+        <w:t>two-month</w:t>
+      </w:r>
+      <w:r>
+        <w:rPr>
+          <w:color w:val="1A1A1A"/>
+        </w:rPr>
+        <w:t xml:space="preserve"> programme delay caused by an inverter supply shortage, re-planning installation dates and re-sequencing site works to limit knock-on effects for the client.</w:t>
       </w:r>
     </w:p>
     <w:p>
@@ -683,27 +886,54 @@
         <w:rPr>
           <w:color w:val="1A1A1A"/>
         </w:rPr>
-        <w:t>Maintained bills of material and material call off schedules with procurement, tracking milestones and flagging slippage early to protect the installation programme.</w:t>
-      </w:r>
-    </w:p>
-    <w:p>
-      <w:pPr>
-        <w:pStyle w:val="ListParagraph"/>
-        <w:numPr>
-          <w:ilvl w:val="0"/>
-          <w:numId w:val="2"/>
-        </w:numPr>
-        <w:spacing w:after="56" w:line="252" w:lineRule="auto"/>
-      </w:pPr>
-      <w:r>
-        <w:rPr>
-          <w:color w:val="1A1A1A"/>
-        </w:rPr>
-        <w:t>Carried out commissioning, testing and fault finding, closed out snag lists and issued as built documentation to clients.</w:t>
-      </w:r>
-    </w:p>
-    <w:p>
-      <w:pPr>
+        <w:t xml:space="preserve">Maintained bills of material and material </w:t>
+      </w:r>
+      <w:r>
+        <w:rPr>
+          <w:color w:val="1A1A1A"/>
+        </w:rPr>
+        <w:t>call-off</w:t>
+      </w:r>
+      <w:r>
+        <w:rPr>
+          <w:color w:val="1A1A1A"/>
+        </w:rPr>
+        <w:t xml:space="preserve"> schedules with procurement, tracking milestones and flagging slippage early to protect the installation programme.</w:t>
+      </w:r>
+    </w:p>
+    <w:p>
+      <w:pPr>
+        <w:pStyle w:val="ListParagraph"/>
+        <w:numPr>
+          <w:ilvl w:val="0"/>
+          <w:numId w:val="2"/>
+        </w:numPr>
+        <w:spacing w:after="56" w:line="252" w:lineRule="auto"/>
+      </w:pPr>
+      <w:r>
+        <w:rPr>
+          <w:color w:val="1A1A1A"/>
+        </w:rPr>
+        <w:t xml:space="preserve">Carried out commissioning, testing and fault finding, closed out snag lists and issued </w:t>
+      </w:r>
+      <w:r>
+        <w:rPr>
+          <w:color w:val="1A1A1A"/>
+        </w:rPr>
+        <w:t>as-built</w:t>
+      </w:r>
+      <w:r>
+        <w:rPr>
+          <w:color w:val="1A1A1A"/>
+        </w:rPr>
+        <w:t xml:space="preserve"> documentation to clients.</w:t>
+      </w:r>
+    </w:p>
+    <w:p>
+      <w:pPr>
+        <w:tabs>
+          <w:tab w:val="right" w:pos="10180"/>
+        </w:tabs>
         <w:spacing w:before="142"/>
       </w:pPr>
       <w:r>
@@ -729,7 +959,7 @@
           <w:sz w:val="20"/>
           <w:szCs w:val="20"/>
         </w:rPr>
-        <w:ptab w:relativeTo="margin" w:alignment="right" w:leader="none"/>
+        <w:tab/>
       </w:r>
       <w:r>
         <w:rPr>
@@ -792,6 +1022,9 @@
     </w:p>
     <w:p>
       <w:pPr>
+        <w:tabs>
+          <w:tab w:val="right" w:pos="10180"/>
+        </w:tabs>
         <w:spacing w:before="142"/>
       </w:pPr>
       <w:r>
@@ -802,7 +1035,7 @@
           <w:sz w:val="20"/>
           <w:szCs w:val="20"/>
         </w:rPr>
-        <w:t>Mechatronics Engineer, Intern</w:t>
+        <w:t>Mechatronics Engineer Intern</w:t>
       </w:r>
       <w:r>
         <w:rPr>
@@ -817,7 +1050,7 @@
           <w:sz w:val="20"/>
           <w:szCs w:val="20"/>
         </w:rPr>
-        <w:ptab w:relativeTo="margin" w:alignment="right" w:leader="none"/>
+        <w:tab/>
       </w:r>
       <w:r>
         <w:rPr>
@@ -859,7 +1092,19 @@
         <w:rPr>
           <w:color w:val="1A1A1A"/>
         </w:rPr>
-        <w:t>Built and tested a temperature monitoring system with real time data capture and system validation.</w:t>
+        <w:t xml:space="preserve">Built and tested a temperature monitoring system with </w:t>
+      </w:r>
+      <w:r>
+        <w:rPr>
+          <w:color w:val="1A1A1A"/>
+        </w:rPr>
+        <w:t>real-time</w:t>
+      </w:r>
+      <w:r>
+        <w:rPr>
+          <w:color w:val="1A1A1A"/>
+        </w:rPr>
+        <w:t xml:space="preserve"> data capture and system validation.</w:t>
       </w:r>
     </w:p>
     <w:p>
@@ -941,37 +1186,53 @@
           <w:bCs/>
           <w:color w:val="1A1A1A"/>
         </w:rPr>
-        <w:t xml:space="preserve">Solar UPS system:  </w:t>
-      </w:r>
-      <w:r>
-        <w:rPr>
-          <w:color w:val="1A1A1A"/>
-        </w:rPr>
-        <w:t>PV array, charge controller and 12V DC storage with inverter output, delivering uninterrupted backup power for household electrical loads.</w:t>
-      </w:r>
-    </w:p>
-    <w:p>
-      <w:pPr>
-        <w:pStyle w:val="ListParagraph"/>
-        <w:numPr>
-          <w:ilvl w:val="0"/>
-          <w:numId w:val="2"/>
-        </w:numPr>
-        <w:spacing w:after="56" w:line="252" w:lineRule="auto"/>
-      </w:pPr>
-      <w:r>
-        <w:rPr>
-          <w:b/>
-          <w:bCs/>
-          <w:color w:val="1A1A1A"/>
-        </w:rPr>
-        <w:t xml:space="preserve">Single and dual axis solar trackers:  </w:t>
-      </w:r>
-      <w:r>
-        <w:rPr>
-          <w:color w:val="1A1A1A"/>
-        </w:rPr>
-        <w:t>Arduino, LDR and servo based alignment, plus a GPS and RTC variant computing solar position mathematically for light independent operation.</w:t>
+        <w:t>15.375 kWp elevated rooftop canopy:</w:t>
+      </w:r>
+      <w:r>
+        <w:rPr>
+          <w:b/>
+          <w:bCs/>
+          <w:color w:val="1A1A1A"/>
+        </w:rPr>
+        <w:t xml:space="preserve">  </w:t>
+      </w:r>
+      <w:r>
+        <w:rPr>
+          <w:color w:val="1A1A1A"/>
+        </w:rPr>
+        <w:t>25 bifacial 615 W modules on a 15 kW Fox inverter, carried on a raised steel frame over a rooftop stair room and the open roof in front of it. Designed in SketchUp and built on site.</w:t>
+      </w:r>
+    </w:p>
+    <w:p>
+      <w:pPr>
+        <w:pStyle w:val="ListParagraph"/>
+        <w:numPr>
+          <w:ilvl w:val="0"/>
+          <w:numId w:val="2"/>
+        </w:numPr>
+        <w:spacing w:after="56" w:line="252" w:lineRule="auto"/>
+      </w:pPr>
+      <w:r>
+        <w:rPr>
+          <w:b/>
+          <w:bCs/>
+          <w:color w:val="1A1A1A"/>
+        </w:rPr>
+        <w:t>University projects, Air University:</w:t>
+      </w:r>
+      <w:r>
+        <w:rPr>
+          <w:b/>
+          <w:bCs/>
+          <w:color w:val="1A1A1A"/>
+        </w:rPr>
+        <w:t xml:space="preserve">  </w:t>
+      </w:r>
+      <w:r>
+        <w:rPr>
+          <w:color w:val="1A1A1A"/>
+        </w:rPr>
+        <w:t>a solar UPS system (PV array, charge controller, 12 V DC storage and inverter) and single and dual axis solar trackers (Arduino, LDR and servo, plus a GPS and RTC variant that computes solar position).</w:t>
       </w:r>
     </w:p>
     <w:p>
@@ -996,6 +1257,9 @@
     </w:p>
     <w:p>
       <w:pPr>
+        <w:tabs>
+          <w:tab w:val="right" w:pos="10180"/>
+        </w:tabs>
         <w:spacing w:after="70"/>
       </w:pPr>
       <w:r>
@@ -1013,7 +1277,7 @@
         <w:t xml:space="preserve">   |   Dublin Business School, Ireland</w:t>
       </w:r>
       <w:r>
-        <w:ptab w:relativeTo="margin" w:alignment="right" w:leader="none"/>
+        <w:tab/>
       </w:r>
       <w:r>
         <w:rPr>
@@ -1029,7 +1293,6 @@
     <w:p>
       <w:pPr>
         <w:spacing w:after="90" w:line="264" w:lineRule="auto"/>
-        <w:jc w:val="both"/>
       </w:pPr>
       <w:r>
         <w:rPr>
@@ -1040,6 +1303,9 @@
     </w:p>
     <w:p>
       <w:pPr>
+        <w:tabs>
+          <w:tab w:val="right" w:pos="10180"/>
+        </w:tabs>
         <w:spacing w:after="70"/>
       </w:pPr>
       <w:r>
@@ -1057,7 +1323,7 @@
         <w:t xml:space="preserve">   |   Air University, Islamabad</w:t>
       </w:r>
       <w:r>
-        <w:ptab w:relativeTo="margin" w:alignment="right" w:leader="none"/>
+        <w:tab/>
       </w:r>
       <w:r>
         <w:rPr>
@@ -1073,7 +1339,6 @@
     <w:p>
       <w:pPr>
         <w:spacing w:after="90" w:line="264" w:lineRule="auto"/>
-        <w:jc w:val="both"/>
       </w:pPr>
       <w:r>
         <w:rPr>
@@ -1123,7 +1388,7 @@
         <w:rPr>
           <w:color w:val="1A1A1A"/>
         </w:rPr>
-        <w:t>Google Career Certificate on Coursera, Sep 2026. Scheduling, budgeting, risk and stakeholder management.</w:t>
+        <w:t>Google, on Coursera, Sep 2026.</w:t>
       </w:r>
     </w:p>
     <w:p>
@@ -1335,7 +1600,19 @@
         <w:rPr>
           <w:color w:val="1A1A1A"/>
         </w:rPr>
-        <w:t>Student member of ASME, 2018 to 2019; competitor in inter university robotics competitions; member of the Air University Cultural Society.</w:t>
+        <w:t xml:space="preserve">Student member of ASME, 2018 to 2019; competitor in </w:t>
+      </w:r>
+      <w:r>
+        <w:rPr>
+          <w:color w:val="1A1A1A"/>
+        </w:rPr>
+        <w:t>inter-university</w:t>
+      </w:r>
+      <w:r>
+        <w:rPr>
+          <w:color w:val="1A1A1A"/>
+        </w:rPr>
+        <w:t xml:space="preserve"> robotics competitions; member of the Air University Cultural Society.</w:t>
       </w:r>
     </w:p>
     <w:sectPr>
@@ -2103,6 +2380,18 @@
       <w:szCs w:val="20"/>
     </w:rPr>
   </w:style>
+  <w:style w:type="character" w:styleId="UnresolvedMention">
+    <w:name w:val="Unresolved Mention"/>
+    <w:basedOn w:val="DefaultParagraphFont"/>
+    <w:uiPriority w:val="99"/>
+    <w:semiHidden/>
+    <w:unhideWhenUsed/>
+    <w:rsid w:val="007429BD"/>
+    <w:rPr>
+      <w:color w:val="605E5C"/>
+      <w:shd w:val="clear" w:color="auto" w:fill="E1DFDD"/>
+    </w:rPr>
+  </w:style>
 </w:styles>
 </file>
 

</xml_diff>

<commit_message>
Second fix round: role page pictures and battery proof, dark link preview cards, CV competencies in four lines at 10 pt with bookmarks, full CSP, MS Project file without local path, brand and hyphen consistency
Co-Authored-By: Claude Opus 5.5 <noreply@anthropic.com>
</commit_message>
<xml_diff>
--- a/public/Usama-Javed-CV.docx
+++ b/public/Usama-Javed-CV.docx
@@ -41,10 +41,14 @@
           <w:bottom w:val="single" w:sz="8" w:space="8" w:color="1F4E5F"/>
         </w:pBdr>
         <w:spacing w:after="160"/>
+        <w:rPr>
+          <w:sz w:val="20"/>
+        </w:rPr>
       </w:pPr>
       <w:r>
         <w:rPr>
           <w:color w:val="555555"/>
+          <w:sz w:val="20"/>
         </w:rPr>
         <w:t xml:space="preserve">Dublin, Ireland   •   +353 85 773 5337   •   </w:t>
       </w:r>
@@ -53,6 +57,7 @@
           <w:rPr>
             <w:rStyle w:val="Hyperlink"/>
             <w:color w:val="555555"/>
+            <w:sz w:val="20"/>
             <w:u w:val="none"/>
           </w:rPr>
           <w:t>usamajaved1305@gmail.com</w:t>
@@ -61,6 +66,7 @@
       <w:r>
         <w:rPr>
           <w:color w:val="555555"/>
+          <w:sz w:val="20"/>
         </w:rPr>
         <w:br/>
       </w:r>
@@ -69,6 +75,7 @@
           <w:rPr>
             <w:rStyle w:val="Hyperlink"/>
             <w:color w:val="555555"/>
+            <w:sz w:val="20"/>
             <w:u w:val="none"/>
           </w:rPr>
           <w:t>usamajaved.ie</w:t>
@@ -77,6 +84,7 @@
       <w:r>
         <w:rPr>
           <w:color w:val="555555"/>
+          <w:sz w:val="20"/>
         </w:rPr>
         <w:t xml:space="preserve">   •   </w:t>
       </w:r>
@@ -85,6 +93,7 @@
           <w:rPr>
             <w:rStyle w:val="Hyperlink"/>
             <w:color w:val="555555"/>
+            <w:sz w:val="20"/>
             <w:u w:val="none"/>
           </w:rPr>
           <w:t>linkedin.com/in/usama-javed-553b8624b</w:t>
@@ -97,6 +106,7 @@
           <w:bottom w:val="single" w:sz="4" w:space="4" w:color="C8D3D8"/>
         </w:pBdr>
         <w:spacing w:before="215" w:after="92"/>
+        <w:outlineLvl w:val="0"/>
       </w:pPr>
       <w:r>
         <w:rPr>
@@ -114,64 +124,77 @@
     <w:p>
       <w:pPr>
         <w:spacing w:after="40" w:line="264" w:lineRule="auto"/>
-      </w:pPr>
-      <w:r>
-        <w:rPr>
-          <w:color w:val="1A1A1A"/>
+        <w:rPr>
+          <w:sz w:val="20"/>
+        </w:rPr>
+      </w:pPr>
+      <w:r>
+        <w:rPr>
+          <w:color w:val="1A1A1A"/>
+          <w:sz w:val="20"/>
         </w:rPr>
         <w:t>Mechatronics engineer with three and a half years delivering solar PV projects from site survey through installation, commissioning and client handover, across on-grid, hybrid and off-grid systems. Portfolio of roughly 70</w:t>
       </w:r>
       <w:r>
         <w:rPr>
           <w:color w:val="1A1A1A"/>
+          <w:sz w:val="20"/>
         </w:rPr>
         <w:t>%</w:t>
       </w:r>
       <w:r>
         <w:rPr>
           <w:color w:val="1A1A1A"/>
+          <w:sz w:val="20"/>
         </w:rPr>
         <w:t xml:space="preserve"> residential and 30</w:t>
       </w:r>
       <w:r>
         <w:rPr>
           <w:color w:val="1A1A1A"/>
+          <w:sz w:val="20"/>
         </w:rPr>
         <w:t>%</w:t>
       </w:r>
       <w:r>
         <w:rPr>
           <w:color w:val="1A1A1A"/>
+          <w:sz w:val="20"/>
         </w:rPr>
         <w:t xml:space="preserve"> commercial work, </w:t>
       </w:r>
       <w:r>
         <w:rPr>
           <w:color w:val="1A1A1A"/>
+          <w:sz w:val="20"/>
         </w:rPr>
         <w:t>from small domestic systems to commercial rooftops.</w:t>
       </w:r>
       <w:r>
         <w:rPr>
           <w:color w:val="1A1A1A"/>
+          <w:sz w:val="20"/>
         </w:rPr>
         <w:t xml:space="preserve"> Experienced leading installation crews on live sites and equally strong on the planning side: building project programmes, controlling bills of material and budgets, tracking milestones against baseline and reporting progress to stakeholders. </w:t>
       </w:r>
       <w:r>
         <w:rPr>
           <w:color w:val="1A1A1A"/>
+          <w:sz w:val="20"/>
         </w:rPr>
         <w:t>Currently studying for an MSc</w:t>
       </w:r>
       <w:r>
         <w:rPr>
           <w:color w:val="1A1A1A"/>
+          <w:sz w:val="20"/>
         </w:rPr>
         <w:t xml:space="preserve"> in Business Analytics at Dublin Business School, applying Power BI, SQL and Python to project reporting and </w:t>
       </w:r>
       <w:r>
         <w:rPr>
           <w:color w:val="1A1A1A"/>
+          <w:sz w:val="20"/>
         </w:rPr>
         <w:t>forecasting.</w:t>
       </w:r>
@@ -182,6 +205,7 @@
           <w:bottom w:val="single" w:sz="4" w:space="4" w:color="C8D3D8"/>
         </w:pBdr>
         <w:spacing w:before="215" w:after="92"/>
+        <w:outlineLvl w:val="0"/>
       </w:pPr>
       <w:r>
         <w:rPr>
@@ -204,16 +228,21 @@
           <w:numId w:val="2"/>
         </w:numPr>
         <w:spacing w:after="56" w:line="252" w:lineRule="auto"/>
-      </w:pPr>
-      <w:r>
-        <w:rPr>
-          <w:color w:val="1A1A1A"/>
+        <w:rPr>
+          <w:sz w:val="20"/>
+        </w:rPr>
+      </w:pPr>
+      <w:r>
+        <w:rPr>
+          <w:color w:val="1A1A1A"/>
+          <w:sz w:val="20"/>
         </w:rPr>
         <w:t xml:space="preserve">Delivered over 100 residential and commercial solar PV installations, </w:t>
       </w:r>
       <w:r>
         <w:rPr>
           <w:color w:val="1A1A1A"/>
+          <w:sz w:val="20"/>
         </w:rPr>
         <w:t>ranging from 5 kWp domestic systems to a 115 kWp commercial rooftop.</w:t>
       </w:r>
@@ -226,34 +255,42 @@
           <w:numId w:val="2"/>
         </w:numPr>
         <w:spacing w:after="56" w:line="252" w:lineRule="auto"/>
-      </w:pPr>
-      <w:r>
-        <w:rPr>
-          <w:color w:val="1A1A1A"/>
+        <w:rPr>
+          <w:sz w:val="20"/>
+        </w:rPr>
+      </w:pPr>
+      <w:r>
+        <w:rPr>
+          <w:color w:val="1A1A1A"/>
+          <w:sz w:val="20"/>
         </w:rPr>
         <w:t xml:space="preserve">Managed 36 projects totalling 790 kWp </w:t>
       </w:r>
       <w:r>
         <w:rPr>
           <w:color w:val="1A1A1A"/>
+          <w:sz w:val="20"/>
         </w:rPr>
         <w:t>in a single year at 85 to 90</w:t>
       </w:r>
       <w:r>
         <w:rPr>
           <w:color w:val="1A1A1A"/>
+          <w:sz w:val="20"/>
         </w:rPr>
         <w:t>%</w:t>
       </w:r>
       <w:r>
         <w:rPr>
           <w:color w:val="1A1A1A"/>
+          <w:sz w:val="20"/>
         </w:rPr>
         <w:t xml:space="preserve"> on-time completion</w:t>
       </w:r>
       <w:r>
         <w:rPr>
           <w:color w:val="1A1A1A"/>
+          <w:sz w:val="20"/>
         </w:rPr>
         <w:t>, against supplier stock shortages and labour constraints.</w:t>
       </w:r>
@@ -266,10 +303,14 @@
           <w:numId w:val="2"/>
         </w:numPr>
         <w:spacing w:after="56" w:line="252" w:lineRule="auto"/>
-      </w:pPr>
-      <w:r>
-        <w:rPr>
-          <w:color w:val="1A1A1A"/>
+        <w:rPr>
+          <w:sz w:val="20"/>
+        </w:rPr>
+      </w:pPr>
+      <w:r>
+        <w:rPr>
+          <w:color w:val="1A1A1A"/>
+          <w:sz w:val="20"/>
         </w:rPr>
         <w:t>Supervised installation crews totalling up to 40 people across five concurrent sites.</w:t>
       </w:r>
@@ -280,6 +321,7 @@
           <w:bottom w:val="single" w:sz="4" w:space="4" w:color="C8D3D8"/>
         </w:pBdr>
         <w:spacing w:before="215" w:after="92"/>
+        <w:outlineLvl w:val="0"/>
       </w:pPr>
       <w:r>
         <w:rPr>
@@ -302,254 +344,116 @@
           <w:numId w:val="2"/>
         </w:numPr>
         <w:spacing w:after="56" w:line="252" w:lineRule="auto"/>
-      </w:pPr>
-      <w:r>
-        <w:rPr>
-          <w:b/>
-          <w:bCs/>
-          <w:color w:val="1A1A1A"/>
-        </w:rPr>
-        <w:t xml:space="preserve">Site delivery:  </w:t>
-      </w:r>
-      <w:r>
-        <w:rPr>
-          <w:color w:val="1A1A1A"/>
-        </w:rPr>
-        <w:t xml:space="preserve">installation crew leadership, daily work allocation, activity sequencing, workmanship inspection, snag </w:t>
-      </w:r>
-      <w:r>
-        <w:rPr>
-          <w:color w:val="1A1A1A"/>
-        </w:rPr>
-        <w:t>close-out</w:t>
-      </w:r>
-      <w:r>
-        <w:rPr>
-          <w:color w:val="1A1A1A"/>
-        </w:rPr>
-        <w:t>, client handover.</w:t>
-      </w:r>
-    </w:p>
-    <w:p>
-      <w:pPr>
-        <w:pStyle w:val="ListParagraph"/>
-        <w:numPr>
-          <w:ilvl w:val="0"/>
-          <w:numId w:val="2"/>
-        </w:numPr>
-        <w:spacing w:after="56" w:line="252" w:lineRule="auto"/>
-      </w:pPr>
-      <w:r>
-        <w:rPr>
-          <w:b/>
-          <w:bCs/>
-          <w:color w:val="1A1A1A"/>
-        </w:rPr>
-        <w:t xml:space="preserve">Technical review:  </w:t>
-      </w:r>
-      <w:r>
-        <w:rPr>
-          <w:color w:val="1A1A1A"/>
-        </w:rPr>
-        <w:t>installation drawings, single line diagrams, layouts, load calculations, system sizing; on-grid, hybrid and off-grid PV across rooftop, ground mount and carport.</w:t>
-      </w:r>
-    </w:p>
-    <w:p>
-      <w:pPr>
-        <w:pStyle w:val="ListParagraph"/>
-        <w:numPr>
-          <w:ilvl w:val="0"/>
-          <w:numId w:val="2"/>
-        </w:numPr>
-        <w:spacing w:after="56" w:line="252" w:lineRule="auto"/>
-      </w:pPr>
-      <w:r>
-        <w:rPr>
-          <w:b/>
-          <w:bCs/>
-          <w:color w:val="1A1A1A"/>
-        </w:rPr>
-        <w:t xml:space="preserve">Planning and controls:  </w:t>
-      </w:r>
-      <w:r>
-        <w:rPr>
-          <w:color w:val="1A1A1A"/>
-        </w:rPr>
-        <w:t xml:space="preserve">work breakdown structure, baselines, milestone tracking, critical path awareness, </w:t>
-      </w:r>
-      <w:r>
-        <w:rPr>
-          <w:color w:val="1A1A1A"/>
-        </w:rPr>
-        <w:t>look-ahead</w:t>
-      </w:r>
-      <w:r>
-        <w:rPr>
-          <w:color w:val="1A1A1A"/>
-        </w:rPr>
-        <w:t xml:space="preserve"> programmes, variance reporting, recovery planning.</w:t>
-      </w:r>
-    </w:p>
-    <w:p>
-      <w:pPr>
-        <w:pStyle w:val="ListParagraph"/>
-        <w:numPr>
-          <w:ilvl w:val="0"/>
-          <w:numId w:val="2"/>
-        </w:numPr>
-        <w:spacing w:after="56" w:line="252" w:lineRule="auto"/>
-      </w:pPr>
-      <w:r>
-        <w:rPr>
-          <w:b/>
-          <w:bCs/>
-          <w:color w:val="1A1A1A"/>
-        </w:rPr>
-        <w:t xml:space="preserve">Cost and procurement:  </w:t>
-      </w:r>
-      <w:r>
-        <w:rPr>
-          <w:color w:val="1A1A1A"/>
-        </w:rPr>
-        <w:t xml:space="preserve">budget control, bill of materials, material </w:t>
-      </w:r>
-      <w:r>
-        <w:rPr>
-          <w:color w:val="1A1A1A"/>
-        </w:rPr>
-        <w:t>call-off</w:t>
-      </w:r>
-      <w:r>
-        <w:rPr>
-          <w:color w:val="1A1A1A"/>
-        </w:rPr>
-        <w:t xml:space="preserve"> planning, long lead item tracking.</w:t>
-      </w:r>
-    </w:p>
-    <w:p>
-      <w:pPr>
-        <w:pStyle w:val="ListParagraph"/>
-        <w:numPr>
-          <w:ilvl w:val="0"/>
-          <w:numId w:val="2"/>
-        </w:numPr>
-        <w:spacing w:after="56" w:line="252" w:lineRule="auto"/>
-      </w:pPr>
-      <w:r>
-        <w:rPr>
-          <w:b/>
-          <w:bCs/>
-          <w:color w:val="1A1A1A"/>
-        </w:rPr>
-        <w:t xml:space="preserve">Commissioning:  </w:t>
-      </w:r>
-      <w:r>
-        <w:rPr>
-          <w:color w:val="1A1A1A"/>
-        </w:rPr>
-        <w:t xml:space="preserve">testing, fault finding, </w:t>
-      </w:r>
-      <w:r>
-        <w:rPr>
-          <w:color w:val="1A1A1A"/>
-        </w:rPr>
-        <w:t>as-built</w:t>
-      </w:r>
-      <w:r>
-        <w:rPr>
-          <w:color w:val="1A1A1A"/>
-        </w:rPr>
-        <w:t xml:space="preserve"> documentation, </w:t>
-      </w:r>
-      <w:r>
-        <w:rPr>
-          <w:color w:val="1A1A1A"/>
-        </w:rPr>
-        <w:t>post-installation</w:t>
-      </w:r>
-      <w:r>
-        <w:rPr>
-          <w:color w:val="1A1A1A"/>
-        </w:rPr>
-        <w:t xml:space="preserve"> support.</w:t>
-      </w:r>
-    </w:p>
-    <w:p>
-      <w:pPr>
-        <w:pStyle w:val="ListParagraph"/>
-        <w:numPr>
-          <w:ilvl w:val="0"/>
-          <w:numId w:val="2"/>
-        </w:numPr>
-        <w:spacing w:after="56" w:line="252" w:lineRule="auto"/>
-      </w:pPr>
-      <w:r>
-        <w:rPr>
-          <w:b/>
-          <w:bCs/>
-          <w:color w:val="1A1A1A"/>
-        </w:rPr>
-        <w:t xml:space="preserve">Site HSE:  </w:t>
-      </w:r>
-      <w:r>
-        <w:rPr>
-          <w:color w:val="1A1A1A"/>
-        </w:rPr>
-        <w:t>RAMS awareness, toolbox talks, PPE enforcement, working at height and safe systems of work.</w:t>
-      </w:r>
-    </w:p>
-    <w:p>
-      <w:pPr>
-        <w:pStyle w:val="ListParagraph"/>
-        <w:numPr>
-          <w:ilvl w:val="0"/>
-          <w:numId w:val="2"/>
-        </w:numPr>
-        <w:spacing w:after="56" w:line="252" w:lineRule="auto"/>
-      </w:pPr>
-      <w:r>
-        <w:rPr>
-          <w:b/>
-          <w:bCs/>
-          <w:color w:val="1A1A1A"/>
-        </w:rPr>
-        <w:t xml:space="preserve">Scheduling and data:  </w:t>
-      </w:r>
-      <w:r>
-        <w:rPr>
-          <w:color w:val="1A1A1A"/>
-        </w:rPr>
-        <w:t>Primavera P6, MS Project, advanced MS Excel, Power BI, SQL, Python.</w:t>
-      </w:r>
-    </w:p>
-    <w:p>
-      <w:pPr>
-        <w:pStyle w:val="ListParagraph"/>
-        <w:numPr>
-          <w:ilvl w:val="0"/>
-          <w:numId w:val="2"/>
-        </w:numPr>
-        <w:spacing w:after="56" w:line="252" w:lineRule="auto"/>
-      </w:pPr>
-      <w:r>
-        <w:rPr>
-          <w:b/>
-          <w:bCs/>
-          <w:color w:val="1A1A1A"/>
-        </w:rPr>
-        <w:t xml:space="preserve">Design software:  </w:t>
-      </w:r>
-      <w:r>
-        <w:rPr>
-          <w:color w:val="1A1A1A"/>
-        </w:rPr>
-        <w:t>HelioScope</w:t>
-      </w:r>
-      <w:r>
-        <w:rPr>
-          <w:color w:val="1A1A1A"/>
-        </w:rPr>
-        <w:t>, OpenSolar, SketchUp, AutoCAD.</w:t>
+        <w:rPr>
+          <w:sz w:val="20"/>
+        </w:rPr>
+      </w:pPr>
+      <w:r>
+        <w:rPr>
+          <w:b/>
+          <w:bCs/>
+          <w:color w:val="1A1A1A"/>
+          <w:sz w:val="20"/>
+        </w:rPr>
+        <w:t>Site delivery and HSE:</w:t>
+      </w:r>
+      <w:r>
+        <w:rPr>
+          <w:bCs/>
+          <w:color w:val="1A1A1A"/>
+          <w:sz w:val="20"/>
+        </w:rPr>
+        <w:t xml:space="preserve"> installation crew leadership, daily work allocation, activity sequencing, workmanship inspection, snag close-out, client handover; RAMS awareness, toolbox talks, PPE enforcement, working at height and safe systems of work.</w:t>
+      </w:r>
+    </w:p>
+    <w:p>
+      <w:pPr>
+        <w:pStyle w:val="ListParagraph"/>
+        <w:numPr>
+          <w:ilvl w:val="0"/>
+          <w:numId w:val="2"/>
+        </w:numPr>
+        <w:spacing w:after="56" w:line="252" w:lineRule="auto"/>
+        <w:rPr>
+          <w:sz w:val="20"/>
+        </w:rPr>
+      </w:pPr>
+      <w:r>
+        <w:rPr>
+          <w:b/>
+          <w:bCs/>
+          <w:color w:val="1A1A1A"/>
+          <w:sz w:val="20"/>
+        </w:rPr>
+        <w:t>Engineering and commissioning:</w:t>
+      </w:r>
+      <w:r>
+        <w:rPr>
+          <w:bCs/>
+          <w:color w:val="1A1A1A"/>
+          <w:sz w:val="20"/>
+        </w:rPr>
+        <w:t xml:space="preserve"> installation drawings, single line diagrams, layouts, load calculations, system sizing; on-grid, hybrid and off-grid PV across rooftop, ground mount and carport; testing, fault finding, as-built documentation, post-installation support.</w:t>
+      </w:r>
+    </w:p>
+    <w:p>
+      <w:pPr>
+        <w:pStyle w:val="ListParagraph"/>
+        <w:numPr>
+          <w:ilvl w:val="0"/>
+          <w:numId w:val="2"/>
+        </w:numPr>
+        <w:spacing w:after="56" w:line="252" w:lineRule="auto"/>
+        <w:rPr>
+          <w:sz w:val="20"/>
+        </w:rPr>
+      </w:pPr>
+      <w:r>
+        <w:rPr>
+          <w:b/>
+          <w:bCs/>
+          <w:color w:val="1A1A1A"/>
+          <w:sz w:val="20"/>
+        </w:rPr>
+        <w:t>Planning, controls and cost:</w:t>
+      </w:r>
+      <w:r>
+        <w:rPr>
+          <w:bCs/>
+          <w:color w:val="1A1A1A"/>
+          <w:sz w:val="20"/>
+        </w:rPr>
+        <w:t xml:space="preserve"> work breakdown structure, baselines, milestone tracking, critical path awareness, look-ahead programmes, variance reporting, recovery planning; budget control, bill of materials, material call-off planning, long lead item tracking.</w:t>
+      </w:r>
+    </w:p>
+    <w:p>
+      <w:pPr>
+        <w:pStyle w:val="ListParagraph"/>
+        <w:numPr>
+          <w:ilvl w:val="0"/>
+          <w:numId w:val="2"/>
+        </w:numPr>
+        <w:spacing w:after="56" w:line="252" w:lineRule="auto"/>
+        <w:rPr>
+          <w:sz w:val="20"/>
+        </w:rPr>
+      </w:pPr>
+      <w:r>
+        <w:rPr>
+          <w:b/>
+          <w:bCs/>
+          <w:color w:val="1A1A1A"/>
+          <w:sz w:val="20"/>
+        </w:rPr>
+        <w:t>Software:</w:t>
+      </w:r>
+      <w:r>
+        <w:rPr>
+          <w:bCs/>
+          <w:color w:val="1A1A1A"/>
+          <w:sz w:val="20"/>
+        </w:rPr>
+        <w:t xml:space="preserve"> Primavera P6, MS Project, advanced MS Excel, Power BI, SQL, Python, HelioScope, OpenSolar, SketchUp, AutoCAD.</w:t>
       </w:r>
     </w:p>
     <w:p>
@@ -558,6 +462,7 @@
           <w:bottom w:val="single" w:sz="4" w:space="4" w:color="C8D3D8"/>
         </w:pBdr>
         <w:spacing w:before="215" w:after="92"/>
+        <w:outlineLvl w:val="0"/>
       </w:pPr>
       <w:r>
         <w:rPr>
@@ -578,6 +483,9 @@
           <w:tab w:val="right" w:pos="10180"/>
         </w:tabs>
         <w:spacing w:before="142"/>
+        <w:rPr>
+          <w:sz w:val="20"/>
+        </w:rPr>
       </w:pPr>
       <w:r>
         <w:rPr>
@@ -609,7 +517,6 @@
           <w:i/>
           <w:iCs/>
           <w:color w:val="555555"/>
-          <w:sz w:val="18"/>
           <w:szCs w:val="18"/>
         </w:rPr>
         <w:t>May 2025 to Mar 2026</w:t>
@@ -623,10 +530,14 @@
           <w:numId w:val="2"/>
         </w:numPr>
         <w:spacing w:after="56" w:line="252" w:lineRule="auto"/>
-      </w:pPr>
-      <w:r>
-        <w:rPr>
-          <w:color w:val="1A1A1A"/>
+        <w:rPr>
+          <w:sz w:val="20"/>
+        </w:rPr>
+      </w:pPr>
+      <w:r>
+        <w:rPr>
+          <w:color w:val="1A1A1A"/>
+          <w:sz w:val="20"/>
         </w:rPr>
         <w:t>Managed delivery of 36 residential and commercial solar PV projects totalling 790 kWp, covering site assessment, design validation, installation supervision, commissioning and client handover.</w:t>
       </w:r>
@@ -639,10 +550,14 @@
           <w:numId w:val="2"/>
         </w:numPr>
         <w:spacing w:after="56" w:line="252" w:lineRule="auto"/>
-      </w:pPr>
-      <w:r>
-        <w:rPr>
-          <w:color w:val="1A1A1A"/>
+        <w:rPr>
+          <w:sz w:val="20"/>
+        </w:rPr>
+      </w:pPr>
+      <w:r>
+        <w:rPr>
+          <w:color w:val="1A1A1A"/>
+          <w:sz w:val="20"/>
         </w:rPr>
         <w:t>Led three technical engineers and installation crews totalling up to 40 people across five concurrent sites, allocating daily works and sequencing activities to hold projects to programme.</w:t>
       </w:r>
@@ -655,28 +570,35 @@
           <w:numId w:val="2"/>
         </w:numPr>
         <w:spacing w:after="56" w:line="252" w:lineRule="auto"/>
-      </w:pPr>
-      <w:r>
-        <w:rPr>
-          <w:color w:val="1A1A1A"/>
+        <w:rPr>
+          <w:sz w:val="20"/>
+        </w:rPr>
+      </w:pPr>
+      <w:r>
+        <w:rPr>
+          <w:color w:val="1A1A1A"/>
+          <w:sz w:val="20"/>
         </w:rPr>
         <w:t>Held 85 to 90</w:t>
       </w:r>
       <w:r>
         <w:rPr>
           <w:color w:val="1A1A1A"/>
+          <w:sz w:val="20"/>
         </w:rPr>
         <w:t>%</w:t>
       </w:r>
       <w:r>
         <w:rPr>
           <w:color w:val="1A1A1A"/>
+          <w:sz w:val="20"/>
         </w:rPr>
         <w:t xml:space="preserve"> on-time completion, tracing slippage</w:t>
       </w:r>
       <w:r>
         <w:rPr>
           <w:color w:val="1A1A1A"/>
+          <w:sz w:val="20"/>
         </w:rPr>
         <w:t xml:space="preserve"> to material availability and labour shortages and re-sequencing works to contain the impact on downstream activities.</w:t>
       </w:r>
@@ -689,10 +611,14 @@
           <w:numId w:val="2"/>
         </w:numPr>
         <w:spacing w:after="56" w:line="252" w:lineRule="auto"/>
-      </w:pPr>
-      <w:r>
-        <w:rPr>
-          <w:color w:val="1A1A1A"/>
+        <w:rPr>
+          <w:sz w:val="20"/>
+        </w:rPr>
+      </w:pPr>
+      <w:r>
+        <w:rPr>
+          <w:color w:val="1A1A1A"/>
+          <w:sz w:val="20"/>
         </w:rPr>
         <w:t>Built and maintained project programmes and cost baselines, tracked actual progress against plan and reported status to senior management.</w:t>
       </w:r>
@@ -705,10 +631,14 @@
           <w:numId w:val="2"/>
         </w:numPr>
         <w:spacing w:after="56" w:line="252" w:lineRule="auto"/>
-      </w:pPr>
-      <w:r>
-        <w:rPr>
-          <w:color w:val="1A1A1A"/>
+        <w:rPr>
+          <w:sz w:val="20"/>
+        </w:rPr>
+      </w:pPr>
+      <w:r>
+        <w:rPr>
+          <w:color w:val="1A1A1A"/>
+          <w:sz w:val="20"/>
         </w:rPr>
         <w:t>Validated roof structure, shading, load calculations and system sizing before mobilisation, cutting on-site design changes and rework.</w:t>
       </w:r>
@@ -721,10 +651,14 @@
           <w:numId w:val="2"/>
         </w:numPr>
         <w:spacing w:after="56" w:line="252" w:lineRule="auto"/>
-      </w:pPr>
-      <w:r>
-        <w:rPr>
-          <w:color w:val="1A1A1A"/>
+        <w:rPr>
+          <w:sz w:val="20"/>
+        </w:rPr>
+      </w:pPr>
+      <w:r>
+        <w:rPr>
+          <w:color w:val="1A1A1A"/>
+          <w:sz w:val="20"/>
         </w:rPr>
         <w:t>Acted as site escalation point through installation and commissioning, resolving interface conflicts between mechanical mounting, DC string routing and AC connection works.</w:t>
       </w:r>
@@ -735,6 +669,9 @@
           <w:tab w:val="right" w:pos="10180"/>
         </w:tabs>
         <w:spacing w:before="142"/>
+        <w:rPr>
+          <w:sz w:val="20"/>
+        </w:rPr>
       </w:pPr>
       <w:r>
         <w:rPr>
@@ -766,7 +703,6 @@
           <w:i/>
           <w:iCs/>
           <w:color w:val="555555"/>
-          <w:sz w:val="18"/>
           <w:szCs w:val="18"/>
         </w:rPr>
         <w:t>Feb 2023 to Apr 2025</w:t>
@@ -780,22 +716,28 @@
           <w:numId w:val="2"/>
         </w:numPr>
         <w:spacing w:after="56" w:line="252" w:lineRule="auto"/>
-      </w:pPr>
-      <w:r>
-        <w:rPr>
-          <w:color w:val="1A1A1A"/>
+        <w:rPr>
+          <w:sz w:val="20"/>
+        </w:rPr>
+      </w:pPr>
+      <w:r>
+        <w:rPr>
+          <w:color w:val="1A1A1A"/>
+          <w:sz w:val="20"/>
         </w:rPr>
         <w:t xml:space="preserve">Ran the full project lifecycle on 59 residential and commercial PV installations </w:t>
       </w:r>
       <w:r>
         <w:rPr>
           <w:color w:val="1A1A1A"/>
+          <w:sz w:val="20"/>
         </w:rPr>
         <w:t>ranging from 5 kWp to 115 kWp:</w:t>
       </w:r>
       <w:r>
         <w:rPr>
           <w:color w:val="1A1A1A"/>
+          <w:sz w:val="20"/>
         </w:rPr>
         <w:t xml:space="preserve"> site assessment, system design, installation coordination, commissioning and aftercare.</w:t>
       </w:r>
@@ -808,22 +750,28 @@
           <w:numId w:val="2"/>
         </w:numPr>
         <w:spacing w:after="56" w:line="252" w:lineRule="auto"/>
-      </w:pPr>
-      <w:r>
-        <w:rPr>
-          <w:color w:val="1A1A1A"/>
+        <w:rPr>
+          <w:sz w:val="20"/>
+        </w:rPr>
+      </w:pPr>
+      <w:r>
+        <w:rPr>
+          <w:color w:val="1A1A1A"/>
+          <w:sz w:val="20"/>
         </w:rPr>
         <w:t>Delivered 85 to 95</w:t>
       </w:r>
       <w:r>
         <w:rPr>
           <w:color w:val="1A1A1A"/>
+          <w:sz w:val="20"/>
         </w:rPr>
         <w:t>%</w:t>
       </w:r>
       <w:r>
         <w:rPr>
           <w:color w:val="1A1A1A"/>
+          <w:sz w:val="20"/>
         </w:rPr>
         <w:t xml:space="preserve"> of projects within the agreed programme while running two concurrent projects at a time.</w:t>
       </w:r>
@@ -836,22 +784,29 @@
           <w:numId w:val="2"/>
         </w:numPr>
         <w:spacing w:after="56" w:line="252" w:lineRule="auto"/>
-      </w:pPr>
-      <w:r>
-        <w:rPr>
-          <w:color w:val="1A1A1A"/>
-        </w:rPr>
+        <w:rPr>
+          <w:sz w:val="20"/>
+        </w:rPr>
+      </w:pPr>
+      <w:r>
+        <w:rPr>
+          <w:color w:val="1A1A1A"/>
+          <w:sz w:val="20"/>
+        </w:rPr>
+        <w:lastRenderedPageBreak/>
         <w:t xml:space="preserve">Managed a </w:t>
       </w:r>
       <w:r>
         <w:rPr>
           <w:color w:val="1A1A1A"/>
+          <w:sz w:val="20"/>
         </w:rPr>
         <w:t>two-month</w:t>
       </w:r>
       <w:r>
         <w:rPr>
           <w:color w:val="1A1A1A"/>
+          <w:sz w:val="20"/>
         </w:rPr>
         <w:t xml:space="preserve"> programme delay caused by an inverter supply shortage, re-planning installation dates and re-sequencing site works to limit knock-on effects for the client.</w:t>
       </w:r>
@@ -864,12 +819,15 @@
           <w:numId w:val="2"/>
         </w:numPr>
         <w:spacing w:after="56" w:line="252" w:lineRule="auto"/>
-      </w:pPr>
-      <w:r>
-        <w:rPr>
-          <w:color w:val="1A1A1A"/>
-        </w:rPr>
-        <w:lastRenderedPageBreak/>
+        <w:rPr>
+          <w:sz w:val="20"/>
+        </w:rPr>
+      </w:pPr>
+      <w:r>
+        <w:rPr>
+          <w:color w:val="1A1A1A"/>
+          <w:sz w:val="20"/>
+        </w:rPr>
         <w:t>Reviewed and approved installation drawings, single line diagrams and technical specifications for on-grid, hybrid and off-grid systems.</w:t>
       </w:r>
     </w:p>
@@ -881,22 +839,28 @@
           <w:numId w:val="2"/>
         </w:numPr>
         <w:spacing w:after="56" w:line="252" w:lineRule="auto"/>
-      </w:pPr>
-      <w:r>
-        <w:rPr>
-          <w:color w:val="1A1A1A"/>
+        <w:rPr>
+          <w:sz w:val="20"/>
+        </w:rPr>
+      </w:pPr>
+      <w:r>
+        <w:rPr>
+          <w:color w:val="1A1A1A"/>
+          <w:sz w:val="20"/>
         </w:rPr>
         <w:t xml:space="preserve">Maintained bills of material and material </w:t>
       </w:r>
       <w:r>
         <w:rPr>
           <w:color w:val="1A1A1A"/>
+          <w:sz w:val="20"/>
         </w:rPr>
         <w:t>call-off</w:t>
       </w:r>
       <w:r>
         <w:rPr>
           <w:color w:val="1A1A1A"/>
+          <w:sz w:val="20"/>
         </w:rPr>
         <w:t xml:space="preserve"> schedules with procurement, tracking milestones and flagging slippage early to protect the installation programme.</w:t>
       </w:r>
@@ -909,22 +873,28 @@
           <w:numId w:val="2"/>
         </w:numPr>
         <w:spacing w:after="56" w:line="252" w:lineRule="auto"/>
-      </w:pPr>
-      <w:r>
-        <w:rPr>
-          <w:color w:val="1A1A1A"/>
+        <w:rPr>
+          <w:sz w:val="20"/>
+        </w:rPr>
+      </w:pPr>
+      <w:r>
+        <w:rPr>
+          <w:color w:val="1A1A1A"/>
+          <w:sz w:val="20"/>
         </w:rPr>
         <w:t xml:space="preserve">Carried out commissioning, testing and fault finding, closed out snag lists and issued </w:t>
       </w:r>
       <w:r>
         <w:rPr>
           <w:color w:val="1A1A1A"/>
+          <w:sz w:val="20"/>
         </w:rPr>
         <w:t>as-built</w:t>
       </w:r>
       <w:r>
         <w:rPr>
           <w:color w:val="1A1A1A"/>
+          <w:sz w:val="20"/>
         </w:rPr>
         <w:t xml:space="preserve"> documentation to clients.</w:t>
       </w:r>
@@ -935,6 +905,9 @@
           <w:tab w:val="right" w:pos="10180"/>
         </w:tabs>
         <w:spacing w:before="142"/>
+        <w:rPr>
+          <w:sz w:val="20"/>
+        </w:rPr>
       </w:pPr>
       <w:r>
         <w:rPr>
@@ -966,7 +939,6 @@
           <w:i/>
           <w:iCs/>
           <w:color w:val="555555"/>
-          <w:sz w:val="18"/>
           <w:szCs w:val="18"/>
         </w:rPr>
         <w:t>Sep 2022 to Jan 2023</w:t>
@@ -980,10 +952,14 @@
           <w:numId w:val="2"/>
         </w:numPr>
         <w:spacing w:after="56" w:line="252" w:lineRule="auto"/>
-      </w:pPr>
-      <w:r>
-        <w:rPr>
-          <w:color w:val="1A1A1A"/>
+        <w:rPr>
+          <w:sz w:val="20"/>
+        </w:rPr>
+      </w:pPr>
+      <w:r>
+        <w:rPr>
+          <w:color w:val="1A1A1A"/>
+          <w:sz w:val="20"/>
         </w:rPr>
         <w:t>Supported execution of seven residential and commercial solar projects, developing scope and duration assumptions from installation drawings, load calculations and technical specifications.</w:t>
       </w:r>
@@ -996,10 +972,14 @@
           <w:numId w:val="2"/>
         </w:numPr>
         <w:spacing w:after="56" w:line="252" w:lineRule="auto"/>
-      </w:pPr>
-      <w:r>
-        <w:rPr>
-          <w:color w:val="1A1A1A"/>
+        <w:rPr>
+          <w:sz w:val="20"/>
+        </w:rPr>
+      </w:pPr>
+      <w:r>
+        <w:rPr>
+          <w:color w:val="1A1A1A"/>
+          <w:sz w:val="20"/>
         </w:rPr>
         <w:t>Conducted 12 site inspections to monitor progress, verify workmanship against specification and enforce site safety standards.</w:t>
       </w:r>
@@ -1012,10 +992,14 @@
           <w:numId w:val="2"/>
         </w:numPr>
         <w:spacing w:after="56" w:line="252" w:lineRule="auto"/>
-      </w:pPr>
-      <w:r>
-        <w:rPr>
-          <w:color w:val="1A1A1A"/>
+        <w:rPr>
+          <w:sz w:val="20"/>
+        </w:rPr>
+      </w:pPr>
+      <w:r>
+        <w:rPr>
+          <w:color w:val="1A1A1A"/>
+          <w:sz w:val="20"/>
         </w:rPr>
         <w:t>Managed interfaces and dependencies between MEP, solar PV and installation teams to protect completion dates.</w:t>
       </w:r>
@@ -1026,6 +1010,9 @@
           <w:tab w:val="right" w:pos="10180"/>
         </w:tabs>
         <w:spacing w:before="142"/>
+        <w:rPr>
+          <w:sz w:val="20"/>
+        </w:rPr>
       </w:pPr>
       <w:r>
         <w:rPr>
@@ -1057,7 +1044,6 @@
           <w:i/>
           <w:iCs/>
           <w:color w:val="555555"/>
-          <w:sz w:val="18"/>
           <w:szCs w:val="18"/>
         </w:rPr>
         <w:t>Jul 2022 to Aug 2022</w:t>
@@ -1071,10 +1057,14 @@
           <w:numId w:val="2"/>
         </w:numPr>
         <w:spacing w:after="56" w:line="252" w:lineRule="auto"/>
-      </w:pPr>
-      <w:r>
-        <w:rPr>
-          <w:color w:val="1A1A1A"/>
+        <w:rPr>
+          <w:sz w:val="20"/>
+        </w:rPr>
+      </w:pPr>
+      <w:r>
+        <w:rPr>
+          <w:color w:val="1A1A1A"/>
+          <w:sz w:val="20"/>
         </w:rPr>
         <w:t>PIC microcontroller programming and sensor and hardware interfacing for automation and embedded system applications.</w:t>
       </w:r>
@@ -1087,22 +1077,28 @@
           <w:numId w:val="2"/>
         </w:numPr>
         <w:spacing w:after="56" w:line="252" w:lineRule="auto"/>
-      </w:pPr>
-      <w:r>
-        <w:rPr>
-          <w:color w:val="1A1A1A"/>
+        <w:rPr>
+          <w:sz w:val="20"/>
+        </w:rPr>
+      </w:pPr>
+      <w:r>
+        <w:rPr>
+          <w:color w:val="1A1A1A"/>
+          <w:sz w:val="20"/>
         </w:rPr>
         <w:t xml:space="preserve">Built and tested a temperature monitoring system with </w:t>
       </w:r>
       <w:r>
         <w:rPr>
           <w:color w:val="1A1A1A"/>
+          <w:sz w:val="20"/>
         </w:rPr>
         <w:t>real-time</w:t>
       </w:r>
       <w:r>
         <w:rPr>
           <w:color w:val="1A1A1A"/>
+          <w:sz w:val="20"/>
         </w:rPr>
         <w:t xml:space="preserve"> data capture and system validation.</w:t>
       </w:r>
@@ -1113,6 +1109,7 @@
           <w:bottom w:val="single" w:sz="4" w:space="4" w:color="C8D3D8"/>
         </w:pBdr>
         <w:spacing w:before="215" w:after="92"/>
+        <w:outlineLvl w:val="0"/>
       </w:pPr>
       <w:r>
         <w:rPr>
@@ -1135,12 +1132,16 @@
           <w:numId w:val="2"/>
         </w:numPr>
         <w:spacing w:after="56" w:line="252" w:lineRule="auto"/>
-      </w:pPr>
-      <w:r>
-        <w:rPr>
-          <w:b/>
-          <w:bCs/>
-          <w:color w:val="1A1A1A"/>
+        <w:rPr>
+          <w:sz w:val="20"/>
+        </w:rPr>
+      </w:pPr>
+      <w:r>
+        <w:rPr>
+          <w:b/>
+          <w:bCs/>
+          <w:color w:val="1A1A1A"/>
+          <w:sz w:val="20"/>
         </w:rPr>
         <w:t>115 kWp commercial rooftop:</w:t>
       </w:r>
@@ -1149,24 +1150,28 @@
           <w:b/>
           <w:bCs/>
           <w:color w:val="1A1A1A"/>
+          <w:sz w:val="20"/>
         </w:rPr>
         <w:t xml:space="preserve">  </w:t>
       </w:r>
       <w:r>
         <w:rPr>
           <w:color w:val="1A1A1A"/>
+          <w:sz w:val="20"/>
         </w:rPr>
         <w:t>largest system worked. The roof runs south east rather than south, so facing the array due south would fit only 163 modules. 198 modules at 114.84 kWp in eleven strings of eighteen.</w:t>
       </w:r>
       <w:r>
         <w:rPr>
           <w:color w:val="1A1A1A"/>
+          <w:sz w:val="20"/>
         </w:rPr>
         <w:t xml:space="preserve"> </w:t>
       </w:r>
       <w:r>
         <w:rPr>
           <w:color w:val="1A1A1A"/>
+          <w:sz w:val="20"/>
         </w:rPr>
         <w:t>Set the array out along the building at 146 degrees instead, sized the strings at 1,012 V against an 1,100 V inverter limit on the coldest morning, and settled the fusing from the inverter’s tracker layout, so no string fuses are needed.</w:t>
       </w:r>
@@ -1179,12 +1184,16 @@
           <w:numId w:val="2"/>
         </w:numPr>
         <w:spacing w:after="56" w:line="252" w:lineRule="auto"/>
-      </w:pPr>
-      <w:r>
-        <w:rPr>
-          <w:b/>
-          <w:bCs/>
-          <w:color w:val="1A1A1A"/>
+        <w:rPr>
+          <w:sz w:val="20"/>
+        </w:rPr>
+      </w:pPr>
+      <w:r>
+        <w:rPr>
+          <w:b/>
+          <w:bCs/>
+          <w:color w:val="1A1A1A"/>
+          <w:sz w:val="20"/>
         </w:rPr>
         <w:t>15.375 kWp elevated rooftop canopy:</w:t>
       </w:r>
@@ -1193,30 +1202,50 @@
           <w:b/>
           <w:bCs/>
           <w:color w:val="1A1A1A"/>
+          <w:sz w:val="20"/>
         </w:rPr>
         <w:t xml:space="preserve">  </w:t>
       </w:r>
       <w:r>
         <w:rPr>
           <w:color w:val="1A1A1A"/>
-        </w:rPr>
-        <w:t>25 bifacial 615 W modules on a 15 kW Fox inverter, carried on a raised steel frame over a rooftop stair room and the open roof in front of it. Designed in SketchUp and built on site.</w:t>
-      </w:r>
-    </w:p>
-    <w:p>
-      <w:pPr>
-        <w:pStyle w:val="ListParagraph"/>
-        <w:numPr>
-          <w:ilvl w:val="0"/>
-          <w:numId w:val="2"/>
-        </w:numPr>
-        <w:spacing w:after="56" w:line="252" w:lineRule="auto"/>
-      </w:pPr>
-      <w:r>
-        <w:rPr>
-          <w:b/>
-          <w:bCs/>
-          <w:color w:val="1A1A1A"/>
+          <w:sz w:val="20"/>
+        </w:rPr>
+        <w:t xml:space="preserve">25 bifacial 615 W modules on a </w:t>
+      </w:r>
+      <w:r>
+        <w:rPr>
+          <w:color w:val="1A1A1A"/>
+          <w:sz w:val="20"/>
+        </w:rPr>
+        <w:t>15 kW FoxESS inverter</w:t>
+      </w:r>
+      <w:r>
+        <w:rPr>
+          <w:color w:val="1A1A1A"/>
+          <w:sz w:val="20"/>
+        </w:rPr>
+        <w:t>, carried on a raised steel frame over a rooftop stair room and the open roof in front of it. Designed in SketchUp and built on site.</w:t>
+      </w:r>
+    </w:p>
+    <w:p>
+      <w:pPr>
+        <w:pStyle w:val="ListParagraph"/>
+        <w:numPr>
+          <w:ilvl w:val="0"/>
+          <w:numId w:val="2"/>
+        </w:numPr>
+        <w:spacing w:after="56" w:line="252" w:lineRule="auto"/>
+        <w:rPr>
+          <w:sz w:val="20"/>
+        </w:rPr>
+      </w:pPr>
+      <w:r>
+        <w:rPr>
+          <w:b/>
+          <w:bCs/>
+          <w:color w:val="1A1A1A"/>
+          <w:sz w:val="20"/>
         </w:rPr>
         <w:t>University projects, Air University:</w:t>
       </w:r>
@@ -1225,12 +1254,14 @@
           <w:b/>
           <w:bCs/>
           <w:color w:val="1A1A1A"/>
+          <w:sz w:val="20"/>
         </w:rPr>
         <w:t xml:space="preserve">  </w:t>
       </w:r>
       <w:r>
         <w:rPr>
           <w:color w:val="1A1A1A"/>
+          <w:sz w:val="20"/>
         </w:rPr>
         <w:t>a solar UPS system (PV array, charge controller, 12 V DC storage and inverter) and single and dual axis solar trackers (Arduino, LDR and servo, plus a GPS and RTC variant that computes solar position).</w:t>
       </w:r>
@@ -1241,6 +1272,7 @@
           <w:bottom w:val="single" w:sz="4" w:space="4" w:color="C8D3D8"/>
         </w:pBdr>
         <w:spacing w:before="215" w:after="92"/>
+        <w:outlineLvl w:val="0"/>
       </w:pPr>
       <w:r>
         <w:rPr>
@@ -1261,22 +1293,30 @@
           <w:tab w:val="right" w:pos="10180"/>
         </w:tabs>
         <w:spacing w:after="70"/>
-      </w:pPr>
-      <w:r>
-        <w:rPr>
-          <w:b/>
-          <w:bCs/>
-          <w:color w:val="1A1A1A"/>
+        <w:rPr>
+          <w:sz w:val="20"/>
+        </w:rPr>
+      </w:pPr>
+      <w:r>
+        <w:rPr>
+          <w:b/>
+          <w:bCs/>
+          <w:color w:val="1A1A1A"/>
+          <w:sz w:val="20"/>
         </w:rPr>
         <w:t>MSc Business Analytics</w:t>
       </w:r>
       <w:r>
         <w:rPr>
           <w:color w:val="1A1A1A"/>
+          <w:sz w:val="20"/>
         </w:rPr>
         <w:t xml:space="preserve">   |   Dublin Business School, Ireland</w:t>
       </w:r>
       <w:r>
+        <w:rPr>
+          <w:sz w:val="20"/>
+        </w:rPr>
         <w:tab/>
       </w:r>
       <w:r>
@@ -1284,7 +1324,6 @@
           <w:i/>
           <w:iCs/>
           <w:color w:val="555555"/>
-          <w:sz w:val="18"/>
           <w:szCs w:val="18"/>
         </w:rPr>
         <w:t>2026 to Present</w:t>
@@ -1293,10 +1332,14 @@
     <w:p>
       <w:pPr>
         <w:spacing w:after="90" w:line="264" w:lineRule="auto"/>
-      </w:pPr>
-      <w:r>
-        <w:rPr>
-          <w:color w:val="1A1A1A"/>
+        <w:rPr>
+          <w:sz w:val="20"/>
+        </w:rPr>
+      </w:pPr>
+      <w:r>
+        <w:rPr>
+          <w:color w:val="1A1A1A"/>
+          <w:sz w:val="20"/>
         </w:rPr>
         <w:t>Coursework: data modelling and visualisation in Power BI, SQL and Python analytics, forecasting, project and operations decision analysis.</w:t>
       </w:r>
@@ -1307,22 +1350,30 @@
           <w:tab w:val="right" w:pos="10180"/>
         </w:tabs>
         <w:spacing w:after="70"/>
-      </w:pPr>
-      <w:r>
-        <w:rPr>
-          <w:b/>
-          <w:bCs/>
-          <w:color w:val="1A1A1A"/>
+        <w:rPr>
+          <w:sz w:val="20"/>
+        </w:rPr>
+      </w:pPr>
+      <w:r>
+        <w:rPr>
+          <w:b/>
+          <w:bCs/>
+          <w:color w:val="1A1A1A"/>
+          <w:sz w:val="20"/>
         </w:rPr>
         <w:t>BE Mechatronics Engineering</w:t>
       </w:r>
       <w:r>
         <w:rPr>
           <w:color w:val="1A1A1A"/>
+          <w:sz w:val="20"/>
         </w:rPr>
         <w:t xml:space="preserve">   |   Air University, Islamabad</w:t>
       </w:r>
       <w:r>
+        <w:rPr>
+          <w:sz w:val="20"/>
+        </w:rPr>
         <w:tab/>
       </w:r>
       <w:r>
@@ -1330,7 +1381,6 @@
           <w:i/>
           <w:iCs/>
           <w:color w:val="555555"/>
-          <w:sz w:val="18"/>
           <w:szCs w:val="18"/>
         </w:rPr>
         <w:t>2018 to 2022</w:t>
@@ -1339,10 +1389,14 @@
     <w:p>
       <w:pPr>
         <w:spacing w:after="90" w:line="264" w:lineRule="auto"/>
-      </w:pPr>
-      <w:r>
-        <w:rPr>
-          <w:color w:val="1A1A1A"/>
+        <w:rPr>
+          <w:sz w:val="20"/>
+        </w:rPr>
+      </w:pPr>
+      <w:r>
+        <w:rPr>
+          <w:color w:val="1A1A1A"/>
+          <w:sz w:val="20"/>
         </w:rPr>
         <w:t>Coursework: electric circuits analysis, electronic devices and circuits, control systems, instrumentation and measurement, manufacturing automation, engineering statics, mechanics of materials, fundamentals of thermal sciences, engineering drawing and solid modelling, modelling and simulation, engineering economics.</w:t>
       </w:r>
@@ -1353,6 +1407,7 @@
           <w:bottom w:val="single" w:sz="4" w:space="4" w:color="C8D3D8"/>
         </w:pBdr>
         <w:spacing w:before="215" w:after="92"/>
+        <w:outlineLvl w:val="0"/>
       </w:pPr>
       <w:r>
         <w:rPr>
@@ -1375,18 +1430,23 @@
           <w:numId w:val="2"/>
         </w:numPr>
         <w:spacing w:after="56" w:line="252" w:lineRule="auto"/>
-      </w:pPr>
-      <w:r>
-        <w:rPr>
-          <w:b/>
-          <w:bCs/>
-          <w:color w:val="1A1A1A"/>
+        <w:rPr>
+          <w:sz w:val="20"/>
+        </w:rPr>
+      </w:pPr>
+      <w:r>
+        <w:rPr>
+          <w:b/>
+          <w:bCs/>
+          <w:color w:val="1A1A1A"/>
+          <w:sz w:val="20"/>
         </w:rPr>
         <w:t xml:space="preserve">Foundations of Project Management:  </w:t>
       </w:r>
       <w:r>
         <w:rPr>
           <w:color w:val="1A1A1A"/>
+          <w:sz w:val="20"/>
         </w:rPr>
         <w:t>Google, on Coursera, Sep 2026.</w:t>
       </w:r>
@@ -1399,18 +1459,23 @@
           <w:numId w:val="2"/>
         </w:numPr>
         <w:spacing w:after="56" w:line="252" w:lineRule="auto"/>
-      </w:pPr>
-      <w:r>
-        <w:rPr>
-          <w:b/>
-          <w:bCs/>
-          <w:color w:val="1A1A1A"/>
+        <w:rPr>
+          <w:sz w:val="20"/>
+        </w:rPr>
+      </w:pPr>
+      <w:r>
+        <w:rPr>
+          <w:b/>
+          <w:bCs/>
+          <w:color w:val="1A1A1A"/>
+          <w:sz w:val="20"/>
         </w:rPr>
         <w:t xml:space="preserve">Photovoltaic Systems:  </w:t>
       </w:r>
       <w:r>
         <w:rPr>
           <w:color w:val="1A1A1A"/>
+          <w:sz w:val="20"/>
         </w:rPr>
         <w:t>Technical University of Denmark (DTU) on Coursera, Sep 2024.</w:t>
       </w:r>
@@ -1423,18 +1488,23 @@
           <w:numId w:val="2"/>
         </w:numPr>
         <w:spacing w:after="56" w:line="252" w:lineRule="auto"/>
-      </w:pPr>
-      <w:r>
-        <w:rPr>
-          <w:b/>
-          <w:bCs/>
-          <w:color w:val="1A1A1A"/>
+        <w:rPr>
+          <w:sz w:val="20"/>
+        </w:rPr>
+      </w:pPr>
+      <w:r>
+        <w:rPr>
+          <w:b/>
+          <w:bCs/>
+          <w:color w:val="1A1A1A"/>
+          <w:sz w:val="20"/>
         </w:rPr>
         <w:t xml:space="preserve">Solar Energy and Electrical System Design:  </w:t>
       </w:r>
       <w:r>
         <w:rPr>
           <w:color w:val="1A1A1A"/>
+          <w:sz w:val="20"/>
         </w:rPr>
         <w:t>University at Buffalo on Coursera, Sep 2024.</w:t>
       </w:r>
@@ -1447,18 +1517,23 @@
           <w:numId w:val="2"/>
         </w:numPr>
         <w:spacing w:after="56" w:line="252" w:lineRule="auto"/>
-      </w:pPr>
-      <w:r>
-        <w:rPr>
-          <w:b/>
-          <w:bCs/>
-          <w:color w:val="1A1A1A"/>
+        <w:rPr>
+          <w:sz w:val="20"/>
+        </w:rPr>
+      </w:pPr>
+      <w:r>
+        <w:rPr>
+          <w:b/>
+          <w:bCs/>
+          <w:color w:val="1A1A1A"/>
+          <w:sz w:val="20"/>
         </w:rPr>
         <w:t xml:space="preserve">Solar Energy Basics:  </w:t>
       </w:r>
       <w:r>
         <w:rPr>
           <w:color w:val="1A1A1A"/>
+          <w:sz w:val="20"/>
         </w:rPr>
         <w:t>State University of New York (SUNY) on Coursera, Sep 2024.</w:t>
       </w:r>
@@ -1471,18 +1546,23 @@
           <w:numId w:val="2"/>
         </w:numPr>
         <w:spacing w:after="56" w:line="252" w:lineRule="auto"/>
-      </w:pPr>
-      <w:r>
-        <w:rPr>
-          <w:b/>
-          <w:bCs/>
-          <w:color w:val="1A1A1A"/>
+        <w:rPr>
+          <w:sz w:val="20"/>
+        </w:rPr>
+      </w:pPr>
+      <w:r>
+        <w:rPr>
+          <w:b/>
+          <w:bCs/>
+          <w:color w:val="1A1A1A"/>
+          <w:sz w:val="20"/>
         </w:rPr>
         <w:t xml:space="preserve">Introduction to Solar PV Design, Installation and Code:  </w:t>
       </w:r>
       <w:r>
         <w:rPr>
           <w:color w:val="1A1A1A"/>
+          <w:sz w:val="20"/>
         </w:rPr>
         <w:t>HeatSpring, taught by Sean White, approved for NABCEP hours, Jul 2024.</w:t>
       </w:r>
@@ -1495,18 +1575,23 @@
           <w:numId w:val="2"/>
         </w:numPr>
         <w:spacing w:after="56" w:line="252" w:lineRule="auto"/>
-      </w:pPr>
-      <w:r>
-        <w:rPr>
-          <w:b/>
-          <w:bCs/>
-          <w:color w:val="1A1A1A"/>
+        <w:rPr>
+          <w:sz w:val="20"/>
+        </w:rPr>
+      </w:pPr>
+      <w:r>
+        <w:rPr>
+          <w:b/>
+          <w:bCs/>
+          <w:color w:val="1A1A1A"/>
+          <w:sz w:val="20"/>
         </w:rPr>
         <w:t xml:space="preserve">Know Your Code, Solar Roof Mounting:  </w:t>
       </w:r>
       <w:r>
         <w:rPr>
           <w:color w:val="1A1A1A"/>
+          <w:sz w:val="20"/>
         </w:rPr>
         <w:t>IronRidge, Mar 2024.</w:t>
       </w:r>
@@ -1519,18 +1604,23 @@
           <w:numId w:val="2"/>
         </w:numPr>
         <w:spacing w:after="56" w:line="252" w:lineRule="auto"/>
-      </w:pPr>
-      <w:r>
-        <w:rPr>
-          <w:b/>
-          <w:bCs/>
-          <w:color w:val="1A1A1A"/>
+        <w:rPr>
+          <w:sz w:val="20"/>
+        </w:rPr>
+      </w:pPr>
+      <w:r>
+        <w:rPr>
+          <w:b/>
+          <w:bCs/>
+          <w:color w:val="1A1A1A"/>
+          <w:sz w:val="20"/>
         </w:rPr>
         <w:t xml:space="preserve">Solar 101, Residential Sales:  </w:t>
       </w:r>
       <w:r>
         <w:rPr>
           <w:color w:val="1A1A1A"/>
+          <w:sz w:val="20"/>
         </w:rPr>
         <w:t>SolarEdge Technologies, Sep 2024.</w:t>
       </w:r>
@@ -1541,6 +1631,7 @@
           <w:bottom w:val="single" w:sz="4" w:space="4" w:color="C8D3D8"/>
         </w:pBdr>
         <w:spacing w:before="215" w:after="92"/>
+        <w:outlineLvl w:val="0"/>
       </w:pPr>
       <w:r>
         <w:rPr>
@@ -1563,18 +1654,23 @@
           <w:numId w:val="2"/>
         </w:numPr>
         <w:spacing w:after="56" w:line="252" w:lineRule="auto"/>
-      </w:pPr>
-      <w:r>
-        <w:rPr>
-          <w:b/>
-          <w:bCs/>
-          <w:color w:val="1A1A1A"/>
+        <w:rPr>
+          <w:sz w:val="20"/>
+        </w:rPr>
+      </w:pPr>
+      <w:r>
+        <w:rPr>
+          <w:b/>
+          <w:bCs/>
+          <w:color w:val="1A1A1A"/>
+          <w:sz w:val="20"/>
         </w:rPr>
         <w:t xml:space="preserve">Languages:  </w:t>
       </w:r>
       <w:r>
         <w:rPr>
           <w:color w:val="1A1A1A"/>
+          <w:sz w:val="20"/>
         </w:rPr>
         <w:t>English (professional), Urdu (native), Punjabi (fluent).</w:t>
       </w:r>
@@ -1587,30 +1683,37 @@
           <w:numId w:val="2"/>
         </w:numPr>
         <w:spacing w:after="56" w:line="252" w:lineRule="auto"/>
-      </w:pPr>
-      <w:r>
-        <w:rPr>
-          <w:b/>
-          <w:bCs/>
-          <w:color w:val="1A1A1A"/>
+        <w:rPr>
+          <w:sz w:val="20"/>
+        </w:rPr>
+      </w:pPr>
+      <w:r>
+        <w:rPr>
+          <w:b/>
+          <w:bCs/>
+          <w:color w:val="1A1A1A"/>
+          <w:sz w:val="20"/>
         </w:rPr>
         <w:t xml:space="preserve">Activities:  </w:t>
       </w:r>
       <w:r>
         <w:rPr>
           <w:color w:val="1A1A1A"/>
+          <w:sz w:val="20"/>
         </w:rPr>
         <w:t xml:space="preserve">Student member of ASME, 2018 to 2019; competitor in </w:t>
       </w:r>
       <w:r>
         <w:rPr>
           <w:color w:val="1A1A1A"/>
+          <w:sz w:val="20"/>
         </w:rPr>
         <w:t>inter-university</w:t>
       </w:r>
       <w:r>
         <w:rPr>
           <w:color w:val="1A1A1A"/>
+          <w:sz w:val="20"/>
         </w:rPr>
         <w:t xml:space="preserve"> robotics competitions; member of the Air University Cultural Society.</w:t>
       </w:r>

</xml_diff>

<commit_message>
790 kWp is the total across 36 projects, not a one-year figure: stat label, descriptions, share card, alt text and CV
Co-Authored-By: Claude Opus 5.5 <noreply@anthropic.com>
</commit_message>
<xml_diff>
--- a/public/Usama-Javed-CV.docx
+++ b/public/Usama-Javed-CV.docx
@@ -264,14 +264,21 @@
           <w:color w:val="1A1A1A"/>
           <w:sz w:val="20"/>
         </w:rPr>
-        <w:t xml:space="preserve">Managed 36 projects totalling 790 kWp </w:t>
-      </w:r>
-      <w:r>
-        <w:rPr>
-          <w:color w:val="1A1A1A"/>
-          <w:sz w:val="20"/>
-        </w:rPr>
-        <w:t>in a single year at 85 to 90</w:t>
+        <w:t xml:space="preserve">Managed 36 projects </w:t>
+      </w:r>
+      <w:r>
+        <w:rPr>
+          <w:color w:val="1A1A1A"/>
+          <w:sz w:val="20"/>
+        </w:rPr>
+        <w:t>totalling 790 kWp at</w:t>
+      </w:r>
+      <w:r>
+        <w:rPr>
+          <w:color w:val="1A1A1A"/>
+          <w:sz w:val="20"/>
+        </w:rPr>
+        <w:t xml:space="preserve"> 85 to 90</w:t>
       </w:r>
       <w:r>
         <w:rPr>

</xml_diff>

<commit_message>
Company names as on LinkedIn: SolarNeon Engineering, Islamabad Solar House Pvt. Ltd., Safeway Renewable Energy (Pvt) Ltd.
Co-Authored-By: Claude Opus 5.5 <noreply@anthropic.com>
</commit_message>
<xml_diff>
--- a/public/Usama-Javed-CV.docx
+++ b/public/Usama-Javed-CV.docx
@@ -510,7 +510,15 @@
           <w:sz w:val="20"/>
           <w:szCs w:val="20"/>
         </w:rPr>
-        <w:t xml:space="preserve">   |   Solar Neon Engineering Pvt Ltd</w:t>
+        <w:t xml:space="preserve">   |   </w:t>
+      </w:r>
+      <w:r>
+        <w:rPr>
+          <w:color w:val="1A1A1A"/>
+          <w:sz w:val="20"/>
+          <w:szCs w:val="20"/>
+        </w:rPr>
+        <w:t>SolarNeon Engineering</w:t>
       </w:r>
       <w:r>
         <w:rPr>
@@ -696,7 +704,15 @@
           <w:sz w:val="20"/>
           <w:szCs w:val="20"/>
         </w:rPr>
-        <w:t xml:space="preserve">   |   Islamabad Solar House Pvt Ltd</w:t>
+        <w:t xml:space="preserve">   |   </w:t>
+      </w:r>
+      <w:r>
+        <w:rPr>
+          <w:color w:val="1A1A1A"/>
+          <w:sz w:val="20"/>
+          <w:szCs w:val="20"/>
+        </w:rPr>
+        <w:t>Islamabad Solar House Pvt. Ltd.</w:t>
       </w:r>
       <w:r>
         <w:rPr>
@@ -932,7 +948,15 @@
           <w:sz w:val="20"/>
           <w:szCs w:val="20"/>
         </w:rPr>
-        <w:t xml:space="preserve">   |   Safeway Renewable Energy Pvt Ltd</w:t>
+        <w:t xml:space="preserve">   |   </w:t>
+      </w:r>
+      <w:r>
+        <w:rPr>
+          <w:color w:val="1A1A1A"/>
+          <w:sz w:val="20"/>
+          <w:szCs w:val="20"/>
+        </w:rPr>
+        <w:t>Safeway Renewable Energy (Pvt) Ltd.</w:t>
       </w:r>
       <w:r>
         <w:rPr>

</xml_diff>